<commit_message>
Deliver v0.4.1 evidence-backed research framework and publication artifacts
</commit_message>
<xml_diff>
--- a/site/reports/numerics/report.docx
+++ b/site/reports/numerics/report.docx
@@ -1,37 +1,49 @@
 
 <file path=word/document.xml><?xml version="1.0" encoding="utf-8"?>
-<w:document xmlns:w="http://schemas.openxmlformats.org/wordprocessingml/2006/main" xmlns:m="http://schemas.openxmlformats.org/officeDocument/2006/math" xmlns:r="http://schemas.openxmlformats.org/officeDocument/2006/relationships" xmlns:o="urn:schemas-microsoft-com:office:office" xmlns:v="urn:schemas-microsoft-com:vml" xmlns:w10="urn:schemas-microsoft-com:office:word" xmlns:a="http://schemas.openxmlformats.org/drawingml/2006/main" xmlns:pic="http://schemas.openxmlformats.org/drawingml/2006/picture" xmlns:wp="http://schemas.openxmlformats.org/drawingml/2006/wordprocessingDrawing">
+<w:document xmlns:a="http://schemas.openxmlformats.org/drawingml/2006/main" xmlns:m="http://schemas.openxmlformats.org/officeDocument/2006/math" xmlns:pic="http://schemas.openxmlformats.org/drawingml/2006/picture" xmlns:r="http://schemas.openxmlformats.org/officeDocument/2006/relationships" xmlns:w="http://schemas.openxmlformats.org/wordprocessingml/2006/main" xmlns:wp="http://schemas.openxmlformats.org/drawingml/2006/wordprocessingDrawing">
   <w:body>
     <w:p>
       <w:pPr>
         <w:pStyle w:val="Title"/>
-      </w:pPr>
-      <w:r>
-        <w:t xml:space="preserve">Softmax Collapse and Softmax Cancellation: Eidos validation</w:t>
-      </w:r>
-    </w:p>
-    <w:p>
-      <w:pPr>
-        <w:pStyle w:val="Author"/>
-      </w:pPr>
-      <w:r>
-        <w:t xml:space="preserve">Eidos numerical validation</w:t>
+        <w:jc w:val="left"/>
+      </w:pPr>
+      <w:r>
+        <w:t xml:space="preserve">Independent validation of Softmax numerical repairs</w:t>
       </w:r>
     </w:p>
     <w:p>
       <w:pPr>
         <w:pStyle w:val="Date"/>
+        <w:jc w:val="left"/>
       </w:pPr>
       <w:r>
         <w:t xml:space="preserve">2026-10-31</w:t>
       </w:r>
     </w:p>
-    <w:bookmarkStart w:id="10" w:name="scope-and-research-gap"/>
+    <w:bookmarkStart w:id="9" w:name="summary"/>
     <w:p>
       <w:pPr>
         <w:pStyle w:val="Heading2"/>
       </w:pPr>
       <w:r>
+        <w:t xml:space="preserve">Summary</w:t>
+      </w:r>
+    </w:p>
+    <w:p>
+      <w:pPr>
+        <w:pStyle w:val="FirstParagraph"/>
+      </w:pPr>
+      <w:r>
+        <w:t xml:space="preserve">Softmax arithmetic can lose scientifically relevant derivatives while conventional stability checks still pass. We evaluate the published repairs [1] using independently defined high-precision references, deliberately broken controls and saved teacher–student models. The tested kernels preserve small target gradients and exact stationarity within the qualified input range. The training experiment separates numerical correctness from generalisation. This report records the repair, unfavorable outcomes and reproducible artifacts, with explicit limits on backend qualification and downstream claims.</w:t>
+      </w:r>
+    </w:p>
+    <w:bookmarkEnd w:id="9"/>
+    <w:bookmarkStart w:id="11" w:name="scope-and-research-gap"/>
+    <w:p>
+      <w:pPr>
+        <w:pStyle w:val="Heading2"/>
+      </w:pPr>
+      <w:r>
         <w:t xml:space="preserve">Scope and research gap</w:t>
       </w:r>
     </w:p>
@@ -45,7 +57,7 @@
       <w:r>
         <w:t xml:space="preserve"> </w:t>
       </w:r>
-      <w:hyperlink r:id="rId9">
+      <w:hyperlink r:id="rId10">
         <w:r>
           <w:rPr>
             <w:rStyle w:val="Hyperlink"/>
@@ -83,8 +95,8 @@
         <w:t xml:space="preserve">Eidos uses this as an adversarial acceptance case: reproducing a displayed number alone is insufficient.</w:t>
       </w:r>
     </w:p>
-    <w:bookmarkEnd w:id="10"/>
-    <w:bookmarkStart w:id="11" w:name="mechanisms"/>
+    <w:bookmarkEnd w:id="11"/>
+    <w:bookmarkStart w:id="12" w:name="mechanisms"/>
     <w:p>
       <w:pPr>
         <w:pStyle w:val="Heading2"/>
@@ -308,14 +320,23 @@
         <w:t xml:space="preserve">, and a zero-sum correction, with the ordinary difference retained for the far branch (source Eqs. 8-9). Teacher logits are required for this contract; already-rounded probabilities cannot recover lost information.</w:t>
       </w:r>
     </w:p>
-    <w:bookmarkEnd w:id="11"/>
-    <w:bookmarkStart w:id="15" w:name="X4d4348d0775ef7d3bbc61ad8a6af31aad79a8db"/>
+    <w:bookmarkEnd w:id="12"/>
+    <w:bookmarkStart w:id="15" w:name="methods"/>
     <w:p>
       <w:pPr>
         <w:pStyle w:val="Heading2"/>
       </w:pPr>
       <w:r>
-        <w:t xml:space="preserve">Reproduction and independent verification</w:t>
+        <w:t xml:space="preserve">Methods</w:t>
+      </w:r>
+    </w:p>
+    <w:bookmarkStart w:id="13" w:name="X34e0ea93273b2fb0fe2392c481ce169da5fe052"/>
+    <w:p>
+      <w:pPr>
+        <w:pStyle w:val="Heading3"/>
+      </w:pPr>
+      <w:r>
+        <w:t xml:space="preserve">Numerical execution and independent references</w:t>
       </w:r>
     </w:p>
     <w:p>
@@ -329,7 +350,7 @@
         <w:t xml:space="preserve"> </w:t>
       </w:r>
       <w:r>
-        <w:t xml:space="preserve">Eidos 4.3.32; Python 3.12.4. No random seed applies to this deterministic grid.</w:t>
+        <w:t xml:space="preserve">Eidos 0.4.1; Python 3.12.4. No random seed applies to this deterministic grid.</w:t>
       </w:r>
       <w:r>
         <w:t xml:space="preserve"> </w:t>
@@ -344,27 +365,58 @@
         <w:t xml:space="preserve">The browser selects recorded cases; it does not simulate float32 training.</w:t>
       </w:r>
     </w:p>
+    <w:bookmarkEnd w:id="13"/>
+    <w:bookmarkStart w:id="14" w:name="statistics-and-experimental-units"/>
+    <w:p>
+      <w:pPr>
+        <w:pStyle w:val="Heading3"/>
+      </w:pPr>
+      <w:r>
+        <w:t xml:space="preserve">Statistics and experimental units</w:t>
+      </w:r>
+    </w:p>
+    <w:p>
+      <w:pPr>
+        <w:pStyle w:val="FirstParagraph"/>
+      </w:pPr>
+      <w:r>
+        <w:t xml:space="preserve">The 96 numerical cases are deterministic input settings, not 96 independent random replicates. No error bars, confidence intervals or significance tests are used for this grid. The teacher–student experiment reports every one of three declared seed pairs; an experimental unit is one trained model, and the paired arms share their initial teacher and split. Individual trajectories are shown.</w:t>
+      </w:r>
+    </w:p>
+    <w:bookmarkEnd w:id="14"/>
+    <w:bookmarkEnd w:id="15"/>
+    <w:bookmarkStart w:id="19" w:name="numerical-results"/>
+    <w:p>
+      <w:pPr>
+        <w:pStyle w:val="Heading2"/>
+      </w:pPr>
+      <w:r>
+        <w:t xml:space="preserve">Numerical results</w:t>
+      </w:r>
+    </w:p>
     <w:p>
       <w:pPr>
         <w:pStyle w:val="CaptionedFigure"/>
+        <w:keepNext w:val="1"/>
+        <w:keepLines w:val="1"/>
       </w:pPr>
       <w:r>
         <w:drawing>
           <wp:inline>
-            <wp:extent cx="5334000" cy="3848082"/>
+            <wp:extent cx="6578600" cy="4745968"/>
             <wp:effectExtent b="0" l="0" r="0" t="0"/>
-            <wp:docPr descr="Measured numerical mechanisms, float32." title="" id="13" name="Picture"/>
+            <wp:docPr descr="Figure 1 | Numerical repair in float32. a, Target-gradient magnitude. b, Relative L2 error against Decimal arithmetic. c, Relative error near the teacher using represented logit differences. d, Absolute L2 error at exact equality. Deterministic cases; no error bars. Exact zeros are labelled. All quantities are dimensionless." title="" id="17" name="Picture"/>
             <a:graphic>
               <a:graphicData uri="http://schemas.openxmlformats.org/drawingml/2006/picture">
                 <pic:pic>
                   <pic:nvPicPr>
-                    <pic:cNvPr descr="figure-float32.png" id="14" name="Picture"/>
+                    <pic:cNvPr descr="figure-float32.png" id="18" name="Picture"/>
                     <pic:cNvPicPr>
                       <a:picLocks noChangeArrowheads="1" noChangeAspect="1"/>
                     </pic:cNvPicPr>
                   </pic:nvPicPr>
                   <pic:blipFill>
-                    <a:blip r:embed="rId12"/>
+                    <a:blip r:embed="rId16"/>
                     <a:stretch>
                       <a:fillRect/>
                     </a:stretch>
@@ -372,7 +424,7 @@
                   <pic:spPr bwMode="auto">
                     <a:xfrm>
                       <a:off x="0" y="0"/>
-                      <a:ext cx="5334000" cy="3848082"/>
+                      <a:ext cx="6578600" cy="4745968"/>
                     </a:xfrm>
                     <a:prstGeom prst="rect">
                       <a:avLst/>
@@ -394,9 +446,32 @@
     <w:p>
       <w:pPr>
         <w:pStyle w:val="ImageCaption"/>
-      </w:pPr>
-      <w:r>
-        <w:t xml:space="preserve">Measured numerical mechanisms, float32.</w:t>
+        <w:keepLines w:val="1"/>
+      </w:pPr>
+      <w:r>
+        <w:rPr>
+          <w:b/>
+          <w:bCs/>
+        </w:rPr>
+        <w:t xml:space="preserve">Figure 1 | Numerical repair in float32.</w:t>
+      </w:r>
+      <w:r>
+        <w:t xml:space="preserve"> </w:t>
+      </w:r>
+      <w:r>
+        <w:t xml:space="preserve">a, Target-gradient magnitude. b, Relative L2 error against Decimal arithmetic. c, Relative error near the teacher using represented logit differences. d, Absolute L2 error at exact equality. Deterministic cases; no error bars. Exact zeros are labelled. All quantities are dimensionless.</w:t>
+      </w:r>
+    </w:p>
+    <w:p>
+      <w:pPr>
+        <w:pStyle w:val="TableCaption"/>
+      </w:pPr>
+      <w:r>
+        <w:rPr>
+          <w:b/>
+          <w:bCs/>
+        </w:rPr>
+        <w:t xml:space="preserve">Table 1 | Selected collapse cases and dimensionless gradient errors.</w:t>
       </w:r>
     </w:p>
     <w:tbl>
@@ -405,6 +480,7 @@
         <w:tblW w:type="pct" w:w="5000"/>
         <w:tblLayout w:type="fixed"/>
         <w:tblLook w:firstRow="1" w:lastRow="0" w:firstColumn="0" w:lastColumn="0" w:noHBand="0" w:noVBand="0" w:val="0020"/>
+        <w:tblCaption w:val="Table 1 | Selected collapse cases and dimensionless gradient errors."/>
       </w:tblPr>
       <w:tblGrid>
         <w:gridCol w:w="1250"/>
@@ -415,13 +491,15 @@
       </w:tblGrid>
       <w:tr>
         <w:trPr>
-          <w:tblHeader w:val="on"/>
+          <w:tblHeader w:val="1"/>
+          <w:cantSplit w:val="1"/>
         </w:trPr>
         <w:tc>
           <w:tcPr/>
           <w:p>
             <w:pPr>
               <w:pStyle w:val="Compact"/>
+              <w:keepNext w:val="1"/>
             </w:pPr>
             <w:r>
               <w:t xml:space="preserve">Input dtype</w:t>
@@ -433,6 +511,7 @@
           <w:p>
             <w:pPr>
               <w:pStyle w:val="Compact"/>
+              <w:keepNext w:val="1"/>
               <w:jc w:val="right"/>
             </w:pPr>
             <w:r>
@@ -445,6 +524,7 @@
           <w:p>
             <w:pPr>
               <w:pStyle w:val="Compact"/>
+              <w:keepNext w:val="1"/>
               <w:jc w:val="right"/>
             </w:pPr>
             <w:r>
@@ -457,6 +537,7 @@
           <w:p>
             <w:pPr>
               <w:pStyle w:val="Compact"/>
+              <w:keepNext w:val="1"/>
               <w:jc w:val="right"/>
             </w:pPr>
             <w:r>
@@ -469,6 +550,7 @@
           <w:p>
             <w:pPr>
               <w:pStyle w:val="Compact"/>
+              <w:keepNext w:val="1"/>
               <w:jc w:val="right"/>
             </w:pPr>
             <w:r>
@@ -483,6 +565,7 @@
           <w:p>
             <w:pPr>
               <w:pStyle w:val="Compact"/>
+              <w:keepNext w:val="1"/>
             </w:pPr>
             <w:r>
               <w:t xml:space="preserve">float32</w:t>
@@ -494,6 +577,7 @@
           <w:p>
             <w:pPr>
               <w:pStyle w:val="Compact"/>
+              <w:keepNext w:val="1"/>
               <w:jc w:val="right"/>
             </w:pPr>
             <w:r>
@@ -506,6 +590,7 @@
           <w:p>
             <w:pPr>
               <w:pStyle w:val="Compact"/>
+              <w:keepNext w:val="1"/>
               <w:jc w:val="right"/>
             </w:pPr>
             <w:r>
@@ -518,6 +603,7 @@
           <w:p>
             <w:pPr>
               <w:pStyle w:val="Compact"/>
+              <w:keepNext w:val="1"/>
               <w:jc w:val="right"/>
             </w:pPr>
             <w:r>
@@ -530,6 +616,7 @@
           <w:p>
             <w:pPr>
               <w:pStyle w:val="Compact"/>
+              <w:keepNext w:val="1"/>
               <w:jc w:val="right"/>
             </w:pPr>
             <w:r>
@@ -537,6 +624,9 @@
             </w:r>
           </w:p>
         </w:tc>
+        <w:trPr>
+          <w:cantSplit w:val="1"/>
+        </w:trPr>
       </w:tr>
       <w:tr>
         <w:tc>
@@ -544,6 +634,7 @@
           <w:p>
             <w:pPr>
               <w:pStyle w:val="Compact"/>
+              <w:keepNext w:val="1"/>
             </w:pPr>
             <w:r>
               <w:t xml:space="preserve">float64</w:t>
@@ -555,6 +646,7 @@
           <w:p>
             <w:pPr>
               <w:pStyle w:val="Compact"/>
+              <w:keepNext w:val="1"/>
               <w:jc w:val="right"/>
             </w:pPr>
             <w:r>
@@ -567,6 +659,7 @@
           <w:p>
             <w:pPr>
               <w:pStyle w:val="Compact"/>
+              <w:keepNext w:val="1"/>
               <w:jc w:val="right"/>
             </w:pPr>
             <w:r>
@@ -579,6 +672,7 @@
           <w:p>
             <w:pPr>
               <w:pStyle w:val="Compact"/>
+              <w:keepNext w:val="1"/>
               <w:jc w:val="right"/>
             </w:pPr>
             <w:r>
@@ -591,6 +685,7 @@
           <w:p>
             <w:pPr>
               <w:pStyle w:val="Compact"/>
+              <w:keepNext w:val="1"/>
               <w:jc w:val="right"/>
             </w:pPr>
             <w:r>
@@ -598,6 +693,9 @@
             </w:r>
           </w:p>
         </w:tc>
+        <w:trPr>
+          <w:cantSplit w:val="1"/>
+        </w:trPr>
       </w:tr>
       <w:tr>
         <w:tc>
@@ -659,16 +757,31 @@
             </w:r>
           </w:p>
         </w:tc>
+        <w:trPr>
+          <w:cantSplit w:val="1"/>
+        </w:trPr>
       </w:tr>
     </w:tbl>
-    <w:bookmarkEnd w:id="15"/>
-    <w:bookmarkStart w:id="16" w:name="cancellation-and-stationarity"/>
+    <w:bookmarkEnd w:id="19"/>
+    <w:bookmarkStart w:id="20" w:name="cancellation-and-stationarity"/>
     <w:p>
       <w:pPr>
         <w:pStyle w:val="Heading2"/>
       </w:pPr>
       <w:r>
         <w:t xml:space="preserve">Cancellation and stationarity</w:t>
+      </w:r>
+    </w:p>
+    <w:p>
+      <w:pPr>
+        <w:pStyle w:val="TableCaption"/>
+      </w:pPr>
+      <w:r>
+        <w:rPr>
+          <w:b/>
+          <w:bCs/>
+        </w:rPr>
+        <w:t xml:space="preserve">Table 2 | Requested and represented perturbations and absolute gradient errors.</w:t>
       </w:r>
     </w:p>
     <w:tbl>
@@ -677,6 +790,7 @@
         <w:tblW w:type="pct" w:w="5000"/>
         <w:tblLayout w:type="fixed"/>
         <w:tblLook w:firstRow="1" w:lastRow="0" w:firstColumn="0" w:lastColumn="0" w:noHBand="0" w:noVBand="0" w:val="0020"/>
+        <w:tblCaption w:val="Table 2 | Requested and represented perturbations and absolute gradient errors."/>
       </w:tblPr>
       <w:tblGrid>
         <w:gridCol w:w="1250"/>
@@ -687,13 +801,15 @@
       </w:tblGrid>
       <w:tr>
         <w:trPr>
-          <w:tblHeader w:val="on"/>
+          <w:tblHeader w:val="1"/>
+          <w:cantSplit w:val="1"/>
         </w:trPr>
         <w:tc>
           <w:tcPr/>
           <w:p>
             <w:pPr>
               <w:pStyle w:val="Compact"/>
+              <w:keepNext w:val="1"/>
             </w:pPr>
             <w:r>
               <w:t xml:space="preserve">Input dtype</w:t>
@@ -705,6 +821,7 @@
           <w:p>
             <w:pPr>
               <w:pStyle w:val="Compact"/>
+              <w:keepNext w:val="1"/>
               <w:jc w:val="right"/>
             </w:pPr>
             <w:r>
@@ -717,6 +834,7 @@
           <w:p>
             <w:pPr>
               <w:pStyle w:val="Compact"/>
+              <w:keepNext w:val="1"/>
               <w:jc w:val="right"/>
             </w:pPr>
             <w:r>
@@ -729,6 +847,7 @@
           <w:p>
             <w:pPr>
               <w:pStyle w:val="Compact"/>
+              <w:keepNext w:val="1"/>
               <w:jc w:val="right"/>
             </w:pPr>
             <w:r>
@@ -741,6 +860,7 @@
           <w:p>
             <w:pPr>
               <w:pStyle w:val="Compact"/>
+              <w:keepNext w:val="1"/>
               <w:jc w:val="right"/>
             </w:pPr>
             <w:r>
@@ -755,6 +875,7 @@
           <w:p>
             <w:pPr>
               <w:pStyle w:val="Compact"/>
+              <w:keepNext w:val="1"/>
             </w:pPr>
             <w:r>
               <w:t xml:space="preserve">float32</w:t>
@@ -766,6 +887,7 @@
           <w:p>
             <w:pPr>
               <w:pStyle w:val="Compact"/>
+              <w:keepNext w:val="1"/>
               <w:jc w:val="right"/>
             </w:pPr>
             <w:r>
@@ -778,6 +900,7 @@
           <w:p>
             <w:pPr>
               <w:pStyle w:val="Compact"/>
+              <w:keepNext w:val="1"/>
               <w:jc w:val="right"/>
             </w:pPr>
             <w:r>
@@ -790,6 +913,7 @@
           <w:p>
             <w:pPr>
               <w:pStyle w:val="Compact"/>
+              <w:keepNext w:val="1"/>
               <w:jc w:val="right"/>
             </w:pPr>
             <w:r>
@@ -802,6 +926,7 @@
           <w:p>
             <w:pPr>
               <w:pStyle w:val="Compact"/>
+              <w:keepNext w:val="1"/>
               <w:jc w:val="right"/>
             </w:pPr>
             <w:r>
@@ -809,6 +934,9 @@
             </w:r>
           </w:p>
         </w:tc>
+        <w:trPr>
+          <w:cantSplit w:val="1"/>
+        </w:trPr>
       </w:tr>
       <w:tr>
         <w:tc>
@@ -816,6 +944,7 @@
           <w:p>
             <w:pPr>
               <w:pStyle w:val="Compact"/>
+              <w:keepNext w:val="1"/>
             </w:pPr>
             <w:r>
               <w:t xml:space="preserve">float32</w:t>
@@ -827,6 +956,7 @@
           <w:p>
             <w:pPr>
               <w:pStyle w:val="Compact"/>
+              <w:keepNext w:val="1"/>
               <w:jc w:val="right"/>
             </w:pPr>
             <w:r>
@@ -839,6 +969,7 @@
           <w:p>
             <w:pPr>
               <w:pStyle w:val="Compact"/>
+              <w:keepNext w:val="1"/>
               <w:jc w:val="right"/>
             </w:pPr>
             <w:r>
@@ -851,6 +982,7 @@
           <w:p>
             <w:pPr>
               <w:pStyle w:val="Compact"/>
+              <w:keepNext w:val="1"/>
               <w:jc w:val="right"/>
             </w:pPr>
             <w:r>
@@ -863,6 +995,7 @@
           <w:p>
             <w:pPr>
               <w:pStyle w:val="Compact"/>
+              <w:keepNext w:val="1"/>
               <w:jc w:val="right"/>
             </w:pPr>
             <w:r>
@@ -870,6 +1003,9 @@
             </w:r>
           </w:p>
         </w:tc>
+        <w:trPr>
+          <w:cantSplit w:val="1"/>
+        </w:trPr>
       </w:tr>
       <w:tr>
         <w:tc>
@@ -877,6 +1013,7 @@
           <w:p>
             <w:pPr>
               <w:pStyle w:val="Compact"/>
+              <w:keepNext w:val="1"/>
             </w:pPr>
             <w:r>
               <w:t xml:space="preserve">float64</w:t>
@@ -888,6 +1025,7 @@
           <w:p>
             <w:pPr>
               <w:pStyle w:val="Compact"/>
+              <w:keepNext w:val="1"/>
               <w:jc w:val="right"/>
             </w:pPr>
             <w:r>
@@ -900,6 +1038,7 @@
           <w:p>
             <w:pPr>
               <w:pStyle w:val="Compact"/>
+              <w:keepNext w:val="1"/>
               <w:jc w:val="right"/>
             </w:pPr>
             <w:r>
@@ -912,6 +1051,7 @@
           <w:p>
             <w:pPr>
               <w:pStyle w:val="Compact"/>
+              <w:keepNext w:val="1"/>
               <w:jc w:val="right"/>
             </w:pPr>
             <w:r>
@@ -924,6 +1064,7 @@
           <w:p>
             <w:pPr>
               <w:pStyle w:val="Compact"/>
+              <w:keepNext w:val="1"/>
               <w:jc w:val="right"/>
             </w:pPr>
             <w:r>
@@ -931,6 +1072,9 @@
             </w:r>
           </w:p>
         </w:tc>
+        <w:trPr>
+          <w:cantSplit w:val="1"/>
+        </w:trPr>
       </w:tr>
       <w:tr>
         <w:tc>
@@ -992,10 +1136,13 @@
             </w:r>
           </w:p>
         </w:tc>
+        <w:trPr>
+          <w:cantSplit w:val="1"/>
+        </w:trPr>
       </w:tr>
     </w:tbl>
-    <w:bookmarkEnd w:id="16"/>
-    <w:bookmarkStart w:id="17" w:name="controls-and-acceptance"/>
+    <w:bookmarkEnd w:id="20"/>
+    <w:bookmarkStart w:id="21" w:name="controls-and-acceptance"/>
     <w:p>
       <w:pPr>
         <w:pStyle w:val="Heading2"/>
@@ -1040,14 +1187,26 @@
         <w:t xml:space="preserve">Validation uses relative gradient errors, not an absolute tolerance floor.</w:t>
       </w:r>
     </w:p>
-    <w:bookmarkEnd w:id="17"/>
-    <w:bookmarkStart w:id="18" w:name="what-the-eidos-pipeline-demonstrates"/>
+    <w:bookmarkEnd w:id="21"/>
+    <w:bookmarkStart w:id="22" w:name="what-the-eidos-pipeline-demonstrates"/>
     <w:p>
       <w:pPr>
         <w:pStyle w:val="Heading2"/>
       </w:pPr>
       <w:r>
         <w:t xml:space="preserve">What the Eidos pipeline demonstrates</w:t>
+      </w:r>
+    </w:p>
+    <w:p>
+      <w:pPr>
+        <w:pStyle w:val="TableCaption"/>
+      </w:pPr>
+      <w:r>
+        <w:rPr>
+          <w:b/>
+          <w:bCs/>
+        </w:rPr>
+        <w:t xml:space="preserve">Table 3 | Pipeline stages and their acceptance evidence.</w:t>
       </w:r>
     </w:p>
     <w:tbl>
@@ -1056,6 +1215,7 @@
         <w:tblW w:type="pct" w:w="5000"/>
         <w:tblLayout w:type="fixed"/>
         <w:tblLook w:firstRow="1" w:lastRow="0" w:firstColumn="0" w:lastColumn="0" w:noHBand="0" w:noVBand="0" w:val="0020"/>
+        <w:tblCaption w:val="Table 3 | Pipeline stages and their acceptance evidence."/>
       </w:tblPr>
       <w:tblGrid>
         <w:gridCol w:w="3960"/>
@@ -1063,13 +1223,15 @@
       </w:tblGrid>
       <w:tr>
         <w:trPr>
-          <w:tblHeader w:val="on"/>
+          <w:tblHeader w:val="1"/>
+          <w:cantSplit w:val="1"/>
         </w:trPr>
         <w:tc>
           <w:tcPr/>
           <w:p>
             <w:pPr>
               <w:pStyle w:val="Compact"/>
+              <w:keepNext w:val="1"/>
             </w:pPr>
             <w:r>
               <w:t xml:space="preserve">Stage</w:t>
@@ -1081,6 +1243,7 @@
           <w:p>
             <w:pPr>
               <w:pStyle w:val="Compact"/>
+              <w:keepNext w:val="1"/>
             </w:pPr>
             <w:r>
               <w:t xml:space="preserve">Acceptance evidence</w:t>
@@ -1094,6 +1257,7 @@
           <w:p>
             <w:pPr>
               <w:pStyle w:val="Compact"/>
+              <w:keepNext w:val="1"/>
             </w:pPr>
             <w:r>
               <w:t xml:space="preserve">Literature to tool</w:t>
@@ -1105,12 +1269,16 @@
           <w:p>
             <w:pPr>
               <w:pStyle w:val="Compact"/>
+              <w:keepNext w:val="1"/>
             </w:pPr>
             <w:r>
               <w:t xml:space="preserve">Existing Paper2Agent conversion upgraded; four MCP tools retained, with call traces</w:t>
             </w:r>
           </w:p>
         </w:tc>
+        <w:trPr>
+          <w:cantSplit w:val="1"/>
+        </w:trPr>
       </w:tr>
       <w:tr>
         <w:tc>
@@ -1118,6 +1286,7 @@
           <w:p>
             <w:pPr>
               <w:pStyle w:val="Compact"/>
+              <w:keepNext w:val="1"/>
             </w:pPr>
             <w:r>
               <w:t xml:space="preserve">Independent verification</w:t>
@@ -1129,12 +1298,16 @@
           <w:p>
             <w:pPr>
               <w:pStyle w:val="Compact"/>
+              <w:keepNext w:val="1"/>
             </w:pPr>
             <w:r>
               <w:t xml:space="preserve">Decimal definitions over represented inputs; float32/64 dtype preservation</w:t>
             </w:r>
           </w:p>
         </w:tc>
+        <w:trPr>
+          <w:cantSplit w:val="1"/>
+        </w:trPr>
       </w:tr>
       <w:tr>
         <w:tc>
@@ -1142,6 +1315,7 @@
           <w:p>
             <w:pPr>
               <w:pStyle w:val="Compact"/>
+              <w:keepNext w:val="1"/>
             </w:pPr>
             <w:r>
               <w:t xml:space="preserve">Falsification</w:t>
@@ -1153,12 +1327,16 @@
           <w:p>
             <w:pPr>
               <w:pStyle w:val="Compact"/>
+              <w:keepNext w:val="1"/>
             </w:pPr>
             <w:r>
               <w:t xml:space="preserve">Collapsed target and stationary-noise controls must be rejected</w:t>
             </w:r>
           </w:p>
         </w:tc>
+        <w:trPr>
+          <w:cantSplit w:val="1"/>
+        </w:trPr>
       </w:tr>
       <w:tr>
         <w:tc>
@@ -1166,6 +1344,7 @@
           <w:p>
             <w:pPr>
               <w:pStyle w:val="Compact"/>
+              <w:keepNext w:val="1"/>
             </w:pPr>
             <w:r>
               <w:t xml:space="preserve">Repeatable delivery</w:t>
@@ -1177,12 +1356,16 @@
           <w:p>
             <w:pPr>
               <w:pStyle w:val="Compact"/>
+              <w:keepNext w:val="1"/>
             </w:pPr>
             <w:r>
               <w:t xml:space="preserve">82 collapse and 14 cancellation cases feed the site, JSON, CSV and this report</w:t>
             </w:r>
           </w:p>
         </w:tc>
+        <w:trPr>
+          <w:cantSplit w:val="1"/>
+        </w:trPr>
       </w:tr>
       <w:tr>
         <w:tc>
@@ -1190,6 +1373,7 @@
           <w:p>
             <w:pPr>
               <w:pStyle w:val="Compact"/>
+              <w:keepNext w:val="1"/>
             </w:pPr>
             <w:r>
               <w:t xml:space="preserve">Reuse</w:t>
@@ -1201,12 +1385,16 @@
           <w:p>
             <w:pPr>
               <w:pStyle w:val="Compact"/>
+              <w:keepNext w:val="1"/>
             </w:pPr>
             <w:r>
               <w:t xml:space="preserve">NumPy kernels, optional first-order Torch kernels and a numerical audit in CI</w:t>
             </w:r>
           </w:p>
         </w:tc>
+        <w:trPr>
+          <w:cantSplit w:val="1"/>
+        </w:trPr>
       </w:tr>
       <w:tr>
         <w:tc>
@@ -1231,10 +1419,13 @@
             </w:r>
           </w:p>
         </w:tc>
+        <w:trPr>
+          <w:cantSplit w:val="1"/>
+        </w:trPr>
       </w:tr>
     </w:tbl>
-    <w:bookmarkEnd w:id="18"/>
-    <w:bookmarkStart w:id="19" w:name="reuse-and-limits"/>
+    <w:bookmarkEnd w:id="22"/>
+    <w:bookmarkStart w:id="23" w:name="reuse-and-limits"/>
     <w:p>
       <w:pPr>
         <w:pStyle w:val="Heading2"/>
@@ -1305,8 +1496,8 @@
         <w:t xml:space="preserve">Static screening is heuristic. A passing built-in kernel does not certify a consumer’s untested backend.</w:t>
       </w:r>
     </w:p>
-    <w:bookmarkEnd w:id="19"/>
-    <w:bookmarkStart w:id="20" w:name="reproduce"/>
+    <w:bookmarkEnd w:id="23"/>
+    <w:bookmarkStart w:id="24" w:name="reproduce"/>
     <w:p>
       <w:pPr>
         <w:pStyle w:val="Heading2"/>
@@ -1436,8 +1627,8 @@
         <w:t xml:space="preserve">The ZIP includes source, lock, tests, evidence, and checksums. JSON and CSV expose every displayed case.</w:t>
       </w:r>
     </w:p>
-    <w:bookmarkEnd w:id="20"/>
-    <w:bookmarkStart w:id="24" w:name="optimizer-level-before-after"/>
+    <w:bookmarkEnd w:id="24"/>
+    <w:bookmarkStart w:id="28" w:name="optimizer-level-before-after"/>
     <w:p>
       <w:pPr>
         <w:pStyle w:val="Heading2"/>
@@ -1458,6 +1649,18 @@
       </w:r>
       <w:r>
         <w:t xml:space="preserve">Both students start with identical represented logits; each runs 2000 full-batch Adam steps.</w:t>
+      </w:r>
+    </w:p>
+    <w:p>
+      <w:pPr>
+        <w:pStyle w:val="TableCaption"/>
+      </w:pPr>
+      <w:r>
+        <w:rPr>
+          <w:b/>
+          <w:bCs/>
+        </w:rPr>
+        <w:t xml:space="preserve">Table 4 | Final displacement and teacher held-out accuracy for every seed pair.</w:t>
       </w:r>
     </w:p>
     <w:tbl>
@@ -1466,6 +1669,7 @@
         <w:tblW w:type="pct" w:w="5000"/>
         <w:tblLayout w:type="fixed"/>
         <w:tblLook w:firstRow="1" w:lastRow="0" w:firstColumn="0" w:lastColumn="0" w:noHBand="0" w:noVBand="0" w:val="0020"/>
+        <w:tblCaption w:val="Table 4 | Final displacement and teacher held-out accuracy for every seed pair."/>
       </w:tblPr>
       <w:tblGrid>
         <w:gridCol w:w="1584"/>
@@ -1475,13 +1679,15 @@
       </w:tblGrid>
       <w:tr>
         <w:trPr>
-          <w:tblHeader w:val="on"/>
+          <w:tblHeader w:val="1"/>
+          <w:cantSplit w:val="1"/>
         </w:trPr>
         <w:tc>
           <w:tcPr/>
           <w:p>
             <w:pPr>
               <w:pStyle w:val="Compact"/>
+              <w:keepNext w:val="1"/>
             </w:pPr>
             <w:r>
               <w:t xml:space="preserve">Seed</w:t>
@@ -1493,6 +1699,7 @@
           <w:p>
             <w:pPr>
               <w:pStyle w:val="Compact"/>
+              <w:keepNext w:val="1"/>
               <w:jc w:val="right"/>
             </w:pPr>
             <w:r>
@@ -1505,6 +1712,7 @@
           <w:p>
             <w:pPr>
               <w:pStyle w:val="Compact"/>
+              <w:keepNext w:val="1"/>
               <w:jc w:val="right"/>
             </w:pPr>
             <w:r>
@@ -1517,6 +1725,7 @@
           <w:p>
             <w:pPr>
               <w:pStyle w:val="Compact"/>
+              <w:keepNext w:val="1"/>
               <w:jc w:val="right"/>
             </w:pPr>
             <w:r>
@@ -1531,6 +1740,7 @@
           <w:p>
             <w:pPr>
               <w:pStyle w:val="Compact"/>
+              <w:keepNext w:val="1"/>
             </w:pPr>
             <w:r>
               <w:t xml:space="preserve">0</w:t>
@@ -1542,6 +1752,7 @@
           <w:p>
             <w:pPr>
               <w:pStyle w:val="Compact"/>
+              <w:keepNext w:val="1"/>
               <w:jc w:val="right"/>
             </w:pPr>
             <w:r>
@@ -1554,6 +1765,7 @@
           <w:p>
             <w:pPr>
               <w:pStyle w:val="Compact"/>
+              <w:keepNext w:val="1"/>
               <w:jc w:val="right"/>
             </w:pPr>
             <w:r>
@@ -1566,6 +1778,7 @@
           <w:p>
             <w:pPr>
               <w:pStyle w:val="Compact"/>
+              <w:keepNext w:val="1"/>
               <w:jc w:val="right"/>
             </w:pPr>
             <w:r>
@@ -1573,6 +1786,9 @@
             </w:r>
           </w:p>
         </w:tc>
+        <w:trPr>
+          <w:cantSplit w:val="1"/>
+        </w:trPr>
       </w:tr>
       <w:tr>
         <w:tc>
@@ -1580,6 +1796,7 @@
           <w:p>
             <w:pPr>
               <w:pStyle w:val="Compact"/>
+              <w:keepNext w:val="1"/>
             </w:pPr>
             <w:r>
               <w:t xml:space="preserve">1</w:t>
@@ -1591,6 +1808,7 @@
           <w:p>
             <w:pPr>
               <w:pStyle w:val="Compact"/>
+              <w:keepNext w:val="1"/>
               <w:jc w:val="right"/>
             </w:pPr>
             <w:r>
@@ -1603,6 +1821,7 @@
           <w:p>
             <w:pPr>
               <w:pStyle w:val="Compact"/>
+              <w:keepNext w:val="1"/>
               <w:jc w:val="right"/>
             </w:pPr>
             <w:r>
@@ -1615,6 +1834,7 @@
           <w:p>
             <w:pPr>
               <w:pStyle w:val="Compact"/>
+              <w:keepNext w:val="1"/>
               <w:jc w:val="right"/>
             </w:pPr>
             <w:r>
@@ -1622,6 +1842,9 @@
             </w:r>
           </w:p>
         </w:tc>
+        <w:trPr>
+          <w:cantSplit w:val="1"/>
+        </w:trPr>
       </w:tr>
       <w:tr>
         <w:tc>
@@ -1671,6 +1894,9 @@
             </w:r>
           </w:p>
         </w:tc>
+        <w:trPr>
+          <w:cantSplit w:val="1"/>
+        </w:trPr>
       </w:tr>
     </w:tbl>
     <w:p>
@@ -1702,24 +1928,26 @@
     <w:p>
       <w:pPr>
         <w:pStyle w:val="CaptionedFigure"/>
+        <w:keepNext w:val="1"/>
+        <w:keepLines w:val="1"/>
       </w:pPr>
       <w:r>
         <w:drawing>
           <wp:inline>
-            <wp:extent cx="5334000" cy="2038817"/>
+            <wp:extent cx="6578600" cy="2514541"/>
             <wp:effectExtent b="0" l="0" r="0" t="0"/>
-            <wp:docPr descr="Every seed: standard drift versus fixed exact stationarity." title="" id="22" name="Picture"/>
+            <wp:docPr descr="Figure 2 | All three paired seeds. a, Parameter L2 displacement. b, Held-out KL in float64. Individual trajectories; fixed arms coincide at zero. No error bars. Symmetric-log KL axis, linear within plus or minus 1e-12." title="" id="26" name="Picture"/>
             <a:graphic>
               <a:graphicData uri="http://schemas.openxmlformats.org/drawingml/2006/picture">
                 <pic:pic>
                   <pic:nvPicPr>
-                    <pic:cNvPr descr="training/trajectory.png" id="23" name="Picture"/>
+                    <pic:cNvPr descr="training/trajectory.png" id="27" name="Picture"/>
                     <pic:cNvPicPr>
                       <a:picLocks noChangeArrowheads="1" noChangeAspect="1"/>
                     </pic:cNvPicPr>
                   </pic:nvPicPr>
                   <pic:blipFill>
-                    <a:blip r:embed="rId21"/>
+                    <a:blip r:embed="rId25"/>
                     <a:stretch>
                       <a:fillRect/>
                     </a:stretch>
@@ -1727,7 +1955,7 @@
                   <pic:spPr bwMode="auto">
                     <a:xfrm>
                       <a:off x="0" y="0"/>
-                      <a:ext cx="5334000" cy="2038817"/>
+                      <a:ext cx="6578600" cy="2514541"/>
                     </a:xfrm>
                     <a:prstGeom prst="rect">
                       <a:avLst/>
@@ -1749,16 +1977,308 @@
     <w:p>
       <w:pPr>
         <w:pStyle w:val="ImageCaption"/>
-      </w:pPr>
-      <w:r>
-        <w:t xml:space="preserve">Every seed: standard drift versus fixed exact stationarity.</w:t>
-      </w:r>
-    </w:p>
-    <w:bookmarkEnd w:id="24"/>
+        <w:keepLines w:val="1"/>
+      </w:pPr>
+      <w:r>
+        <w:rPr>
+          <w:b/>
+          <w:bCs/>
+        </w:rPr>
+        <w:t xml:space="preserve">Figure 2 | All three paired seeds.</w:t>
+      </w:r>
+      <w:r>
+        <w:t xml:space="preserve"> </w:t>
+      </w:r>
+      <w:r>
+        <w:t xml:space="preserve">a, Parameter L2 displacement. b, Held-out KL in float64. Individual trajectories; fixed arms coincide at zero. No error bars. Symmetric-log KL axis, linear within plus or minus 1e-12.</w:t>
+      </w:r>
+    </w:p>
+    <w:bookmarkEnd w:id="28"/>
+    <w:bookmarkStart w:id="31" w:name="data-availability"/>
+    <w:p>
+      <w:pPr>
+        <w:pStyle w:val="Heading2"/>
+      </w:pPr>
+      <w:r>
+        <w:t xml:space="preserve">Data availability</w:t>
+      </w:r>
+    </w:p>
+    <w:p>
+      <w:pPr>
+        <w:pStyle w:val="FirstParagraph"/>
+      </w:pPr>
+      <w:r>
+        <w:t xml:space="preserve">Original protocols, raw measurements, seed/split identifiers and saved-model</w:t>
+      </w:r>
+      <w:r>
+        <w:t xml:space="preserve"> </w:t>
+      </w:r>
+      <w:r>
+        <w:t xml:space="preserve">artifacts are available in</w:t>
+      </w:r>
+      <w:r>
+        <w:t xml:space="preserve"> </w:t>
+      </w:r>
+      <w:hyperlink r:id="rId29">
+        <w:r>
+          <w:rPr>
+            <w:rStyle w:val="Hyperlink"/>
+          </w:rPr>
+          <w:t xml:space="preserve">the evidence record</w:t>
+        </w:r>
+      </w:hyperlink>
+      <w:r>
+        <w:t xml:space="preserve"> </w:t>
+      </w:r>
+      <w:r>
+        <w:t xml:space="preserve">and</w:t>
+      </w:r>
+      <w:r>
+        <w:t xml:space="preserve"> </w:t>
+      </w:r>
+      <w:hyperlink r:id="rId30">
+        <w:r>
+          <w:rPr>
+            <w:rStyle w:val="Hyperlink"/>
+          </w:rPr>
+          <w:t xml:space="preserve">the checksummed reproduction bundle</w:t>
+        </w:r>
+      </w:hyperlink>
+      <w:r>
+        <w:t xml:space="preserve">. Every specified outcome is retained. The repository records code, data</w:t>
+      </w:r>
+      <w:r>
+        <w:t xml:space="preserve"> </w:t>
+      </w:r>
+      <w:r>
+        <w:t xml:space="preserve">and environment hashes; artifact acceptance can be rerun independently.</w:t>
+      </w:r>
+    </w:p>
+    <w:bookmarkEnd w:id="31"/>
+    <w:bookmarkStart w:id="33" w:name="code-availability"/>
+    <w:p>
+      <w:pPr>
+        <w:pStyle w:val="Heading2"/>
+      </w:pPr>
+      <w:r>
+        <w:t xml:space="preserve">Code availability</w:t>
+      </w:r>
+    </w:p>
+    <w:p>
+      <w:pPr>
+        <w:pStyle w:val="FirstParagraph"/>
+      </w:pPr>
+      <w:r>
+        <w:t xml:space="preserve">Source and tests are included in</w:t>
+      </w:r>
+      <w:r>
+        <w:t xml:space="preserve"> </w:t>
+      </w:r>
+      <w:r>
+        <w:rPr>
+          <w:rStyle w:val="VerbatimChar"/>
+        </w:rPr>
+        <w:t xml:space="preserve">reproduce.zip</w:t>
+      </w:r>
+      <w:r>
+        <w:t xml:space="preserve"> </w:t>
+      </w:r>
+      <w:r>
+        <w:t xml:space="preserve">and in the</w:t>
+      </w:r>
+      <w:r>
+        <w:t xml:space="preserve"> </w:t>
+      </w:r>
+      <w:hyperlink r:id="rId32">
+        <w:r>
+          <w:rPr>
+            <w:rStyle w:val="Hyperlink"/>
+          </w:rPr>
+          <w:t xml:space="preserve">EIDOS repository</w:t>
+        </w:r>
+      </w:hyperlink>
+      <w:r>
+        <w:t xml:space="preserve">.</w:t>
+      </w:r>
+      <w:r>
+        <w:t xml:space="preserve"> </w:t>
+      </w:r>
+      <w:r>
+        <w:t xml:space="preserve">Follow the bundle README for CPU acceptance and the recorded runtime for retraining.</w:t>
+      </w:r>
+      <w:r>
+        <w:t xml:space="preserve"> </w:t>
+      </w:r>
+      <w:r>
+        <w:t xml:space="preserve">The original numerical method is attributed to its authors in the references.</w:t>
+      </w:r>
+    </w:p>
+    <w:bookmarkEnd w:id="33"/>
+    <w:bookmarkStart w:id="34" w:name="reporting-and-submission-metadata"/>
+    <w:p>
+      <w:pPr>
+        <w:pStyle w:val="Heading2"/>
+      </w:pPr>
+      <w:r>
+        <w:t xml:space="preserve">Reporting and submission metadata</w:t>
+      </w:r>
+    </w:p>
+    <w:p>
+      <w:pPr>
+        <w:pStyle w:val="FirstParagraph"/>
+      </w:pPr>
+      <w:r>
+        <w:t xml:space="preserve">This is a technical validation report. Authors, affiliations, funding, author</w:t>
+      </w:r>
+      <w:r>
+        <w:t xml:space="preserve"> </w:t>
+      </w:r>
+      <w:r>
+        <w:t xml:space="preserve">contributions and competing-interest declarations must be completed by the human</w:t>
+      </w:r>
+      <w:r>
+        <w:t xml:space="preserve"> </w:t>
+      </w:r>
+      <w:r>
+        <w:t xml:space="preserve">research team before journal submission. No inferred personal or funding metadata</w:t>
+      </w:r>
+      <w:r>
+        <w:t xml:space="preserve"> </w:t>
+      </w:r>
+      <w:r>
+        <w:t xml:space="preserve">has been supplied. Technical production follows the linked figure and manuscript</w:t>
+      </w:r>
+      <w:r>
+        <w:t xml:space="preserve"> </w:t>
+      </w:r>
+      <w:r>
+        <w:t xml:space="preserve">guides; scientific suitability and editorial acceptance require separate review.</w:t>
+      </w:r>
+    </w:p>
+    <w:bookmarkEnd w:id="34"/>
+    <w:bookmarkStart w:id="37" w:name="references"/>
+    <w:p>
+      <w:pPr>
+        <w:pStyle w:val="Heading2"/>
+      </w:pPr>
+      <w:r>
+        <w:t xml:space="preserve">References</w:t>
+      </w:r>
+    </w:p>
+    <w:p>
+      <w:pPr>
+        <w:pStyle w:val="Compact"/>
+        <w:numPr>
+          <w:ilvl w:val="0"/>
+          <w:numId w:val="1001"/>
+        </w:numPr>
+      </w:pPr>
+      <w:r>
+        <w:t xml:space="preserve">Barron, J. T., Gnanapragasam, D. &amp; Tschannen, M.</w:t>
+      </w:r>
+      <w:r>
+        <w:t xml:space="preserve"> </w:t>
+      </w:r>
+      <w:r>
+        <w:rPr>
+          <w:i/>
+          <w:iCs/>
+        </w:rPr>
+        <w:t xml:space="preserve">A Fix for Softmax and</w:t>
+      </w:r>
+      <w:r>
+        <w:rPr>
+          <w:i/>
+          <w:iCs/>
+        </w:rPr>
+        <w:t xml:space="preserve"> </w:t>
+      </w:r>
+      <w:r>
+        <w:rPr>
+          <w:i/>
+          <w:iCs/>
+        </w:rPr>
+        <w:t xml:space="preserve">Cross-Entropy</w:t>
+      </w:r>
+      <w:r>
+        <w:t xml:space="preserve">, version 3.</w:t>
+      </w:r>
+      <w:r>
+        <w:t xml:space="preserve"> </w:t>
+      </w:r>
+      <w:hyperlink r:id="rId10">
+        <w:r>
+          <w:rPr>
+            <w:rStyle w:val="Hyperlink"/>
+          </w:rPr>
+          <w:t xml:space="preserve">arXiv:2610.31642v3</w:t>
+        </w:r>
+      </w:hyperlink>
+      <w:r>
+        <w:t xml:space="preserve">.</w:t>
+      </w:r>
+    </w:p>
+    <w:p>
+      <w:pPr>
+        <w:pStyle w:val="Compact"/>
+        <w:numPr>
+          <w:ilvl w:val="0"/>
+          <w:numId w:val="1001"/>
+        </w:numPr>
+      </w:pPr>
+      <w:r>
+        <w:t xml:space="preserve">Nature.</w:t>
+      </w:r>
+      <w:r>
+        <w:t xml:space="preserve"> </w:t>
+      </w:r>
+      <w:hyperlink r:id="rId35">
+        <w:r>
+          <w:rPr>
+            <w:rStyle w:val="Hyperlink"/>
+          </w:rPr>
+          <w:t xml:space="preserve">Research figure guide</w:t>
+        </w:r>
+      </w:hyperlink>
+      <w:r>
+        <w:t xml:space="preserve">.</w:t>
+      </w:r>
+    </w:p>
+    <w:p>
+      <w:pPr>
+        <w:pStyle w:val="Compact"/>
+        <w:numPr>
+          <w:ilvl w:val="0"/>
+          <w:numId w:val="1001"/>
+        </w:numPr>
+      </w:pPr>
+      <w:r>
+        <w:t xml:space="preserve">Nature.</w:t>
+      </w:r>
+      <w:r>
+        <w:t xml:space="preserve"> </w:t>
+      </w:r>
+      <w:hyperlink r:id="rId36">
+        <w:r>
+          <w:rPr>
+            <w:rStyle w:val="Hyperlink"/>
+          </w:rPr>
+          <w:t xml:space="preserve">Formatting guide</w:t>
+        </w:r>
+      </w:hyperlink>
+      <w:r>
+        <w:t xml:space="preserve">.</w:t>
+      </w:r>
+    </w:p>
+    <w:bookmarkEnd w:id="37"/>
     <w:sectPr>
+      <w:footerReference r:id="rIdEidosPagination" w:type="default"/>
       <w:footnotePr>
         <w:numRestart w:val="eachSect"/>
       </w:footnotePr>
+      <w:pgSz w:h="16838" w:w="11906"/>
+      <w:pgMar w:bottom="1247" w:left="765" w:right="765" w:top="1247"/>
+      <w:lnNumType w:countBy="1" w:distance="200" w:restart="continuous"/>
     </w:sectPr>
   </w:body>
 </w:document>
@@ -1766,6 +2286,22 @@
 
 <file path=word/comments.xml><?xml version="1.0" encoding="utf-8"?>
 <w:comments xmlns:w="http://schemas.openxmlformats.org/wordprocessingml/2006/main" xmlns:m="http://schemas.openxmlformats.org/officeDocument/2006/math" xmlns:r="http://schemas.openxmlformats.org/officeDocument/2006/relationships" xmlns:o="urn:schemas-microsoft-com:office:office" xmlns:v="urn:schemas-microsoft-com:vml" xmlns:w10="urn:schemas-microsoft-com:office:word" xmlns:a="http://schemas.openxmlformats.org/drawingml/2006/main" xmlns:pic="http://schemas.openxmlformats.org/drawingml/2006/picture" xmlns:wp="http://schemas.openxmlformats.org/drawingml/2006/wordprocessingDrawing"/>
+</file>
+
+<file path=word/eidos-pagination.xml><?xml version="1.0" encoding="utf-8"?>
+<w:ftr xmlns:w="http://schemas.openxmlformats.org/wordprocessingml/2006/main">
+  <w:p>
+    <w:pPr>
+      <w:pStyle w:val="Footer"/>
+      <w:jc w:val="center"/>
+    </w:pPr>
+    <w:fldSimple w:instr=" PAGE ">
+      <w:r>
+        <w:t>1</w:t>
+      </w:r>
+    </w:fldSimple>
+  </w:p>
+</w:ftr>
 </file>
 
 <file path=word/footnotes.xml><?xml version="1.0" encoding="utf-8"?>
@@ -1865,21 +2401,136 @@
       </w:pPr>
     </w:lvl>
   </w:abstractNum>
+  <w:abstractNum w:abstractNumId="99411">
+    <w:nsid w:val="00A99411"/>
+    <w:multiLevelType w:val="multilevel"/>
+    <w:lvl w:ilvl="0">
+      <w:start w:val="1"/>
+      <w:numFmt w:val="decimal"/>
+      <w:lvlText w:val="%1."/>
+      <w:lvlJc w:val="left"/>
+      <w:pPr>
+        <w:ind w:left="720" w:hanging="360"/>
+      </w:pPr>
+    </w:lvl>
+    <w:lvl w:ilvl="1">
+      <w:start w:val="1"/>
+      <w:numFmt w:val="decimal"/>
+      <w:lvlText w:val="%2."/>
+      <w:lvlJc w:val="left"/>
+      <w:pPr>
+        <w:ind w:left="1440" w:hanging="360"/>
+      </w:pPr>
+    </w:lvl>
+    <w:lvl w:ilvl="2">
+      <w:start w:val="1"/>
+      <w:numFmt w:val="decimal"/>
+      <w:lvlText w:val="%3."/>
+      <w:lvlJc w:val="left"/>
+      <w:pPr>
+        <w:ind w:left="2160" w:hanging="360"/>
+      </w:pPr>
+    </w:lvl>
+    <w:lvl w:ilvl="3">
+      <w:start w:val="1"/>
+      <w:numFmt w:val="decimal"/>
+      <w:lvlText w:val="%4."/>
+      <w:lvlJc w:val="left"/>
+      <w:pPr>
+        <w:ind w:left="2880" w:hanging="360"/>
+      </w:pPr>
+    </w:lvl>
+    <w:lvl w:ilvl="4">
+      <w:start w:val="1"/>
+      <w:numFmt w:val="decimal"/>
+      <w:lvlText w:val="%5."/>
+      <w:lvlJc w:val="left"/>
+      <w:pPr>
+        <w:ind w:left="3600" w:hanging="360"/>
+      </w:pPr>
+    </w:lvl>
+    <w:lvl w:ilvl="5">
+      <w:start w:val="1"/>
+      <w:numFmt w:val="decimal"/>
+      <w:lvlText w:val="%6."/>
+      <w:lvlJc w:val="left"/>
+      <w:pPr>
+        <w:ind w:left="4320" w:hanging="360"/>
+      </w:pPr>
+    </w:lvl>
+    <w:lvl w:ilvl="6">
+      <w:start w:val="1"/>
+      <w:numFmt w:val="decimal"/>
+      <w:lvlText w:val="%7."/>
+      <w:lvlJc w:val="left"/>
+      <w:pPr>
+        <w:ind w:left="5040" w:hanging="360"/>
+      </w:pPr>
+    </w:lvl>
+    <w:lvl w:ilvl="7">
+      <w:start w:val="1"/>
+      <w:numFmt w:val="decimal"/>
+      <w:lvlText w:val="%8."/>
+      <w:lvlJc w:val="left"/>
+      <w:pPr>
+        <w:ind w:left="5760" w:hanging="360"/>
+      </w:pPr>
+    </w:lvl>
+    <w:lvl w:ilvl="8">
+      <w:start w:val="1"/>
+      <w:numFmt w:val="decimal"/>
+      <w:lvlText w:val="%9."/>
+      <w:lvlJc w:val="left"/>
+      <w:pPr>
+        <w:ind w:left="6480" w:hanging="360"/>
+      </w:pPr>
+    </w:lvl>
+  </w:abstractNum>
   <w:num w:numId="1000">
     <w:abstractNumId w:val="990"/>
+  </w:num>
+  <w:num w:numId="1001">
+    <w:abstractNumId w:val="99411"/>
+    <w:lvlOverride w:ilvl="0">
+      <w:startOverride w:val="1"/>
+    </w:lvlOverride>
+    <w:lvlOverride w:ilvl="1">
+      <w:startOverride w:val="1"/>
+    </w:lvlOverride>
+    <w:lvlOverride w:ilvl="2">
+      <w:startOverride w:val="1"/>
+    </w:lvlOverride>
+    <w:lvlOverride w:ilvl="3">
+      <w:startOverride w:val="1"/>
+    </w:lvlOverride>
+    <w:lvlOverride w:ilvl="4">
+      <w:startOverride w:val="1"/>
+    </w:lvlOverride>
+    <w:lvlOverride w:ilvl="5">
+      <w:startOverride w:val="1"/>
+    </w:lvlOverride>
+    <w:lvlOverride w:ilvl="6">
+      <w:startOverride w:val="1"/>
+    </w:lvlOverride>
+    <w:lvlOverride w:ilvl="7">
+      <w:startOverride w:val="1"/>
+    </w:lvlOverride>
+    <w:lvlOverride w:ilvl="8">
+      <w:startOverride w:val="1"/>
+    </w:lvlOverride>
   </w:num>
 </w:numbering>
 </file>
 
 <file path=word/styles.xml><?xml version="1.0" encoding="utf-8"?>
-<w:styles xmlns:r="http://schemas.openxmlformats.org/officeDocument/2006/relationships" xmlns:w="http://schemas.openxmlformats.org/wordprocessingml/2006/main">
+<w:styles xmlns:w="http://schemas.openxmlformats.org/wordprocessingml/2006/main">
   <w:docDefaults>
     <w:rPrDefault>
       <w:rPr>
-        <w:rFonts w:asciiTheme="minorHAnsi" w:cstheme="minorBidi" w:eastAsiaTheme="minorEastAsia" w:hAnsiTheme="minorHAnsi"/>
+        <w:rFonts w:ascii="Times New Roman" w:cs="Times New Roman" w:hAnsi="Times New Roman"/>
         <w:sz w:val="24"/>
         <w:szCs w:val="24"/>
-        <w:lang w:bidi="ar-SA" w:eastAsia="zh-CN" w:val="en-US"/>
+        <w:lang w:bidi="ar-SA" w:eastAsia="zh-CN" w:val="en"/>
       </w:rPr>
     </w:rPrDefault>
     <w:pPrDefault>
@@ -1892,6 +2543,9 @@
   <w:style w:default="1" w:styleId="Normal" w:type="paragraph">
     <w:name w:val="Normal"/>
     <w:qFormat/>
+    <w:pPr>
+      <w:spacing w:line="480" w:lineRule="auto"/>
+    </w:pPr>
   </w:style>
   <w:style w:styleId="BodyText" w:type="paragraph">
     <w:name w:val="Body Text"/>
@@ -1899,7 +2553,7 @@
     <w:link w:val="BodyTextChar"/>
     <w:qFormat/>
     <w:pPr>
-      <w:spacing w:after="180" w:before="180"/>
+      <w:spacing w:after="180" w:before="180" w:line="480" w:lineRule="auto"/>
     </w:pPr>
   </w:style>
   <w:style w:customStyle="1" w:styleId="FirstParagraph" w:type="paragraph">
@@ -1907,13 +2561,16 @@
     <w:basedOn w:val="BodyText"/>
     <w:next w:val="BodyText"/>
     <w:qFormat/>
+    <w:pPr>
+      <w:spacing w:line="480" w:lineRule="auto"/>
+    </w:pPr>
   </w:style>
   <w:style w:customStyle="1" w:styleId="Compact" w:type="paragraph">
     <w:name w:val="Compact"/>
     <w:basedOn w:val="BodyText"/>
     <w:qFormat/>
     <w:pPr>
-      <w:spacing w:after="36" w:before="36"/>
+      <w:spacing w:after="36" w:before="36" w:line="480" w:lineRule="auto"/>
     </w:pPr>
   </w:style>
   <w:style w:styleId="Title" w:type="paragraph">
@@ -1925,14 +2582,17 @@
     <w:qFormat/>
     <w:rsid w:val="00A10FD9"/>
     <w:pPr>
-      <w:spacing w:after="80" w:line="240" w:lineRule="auto"/>
+      <w:spacing w:after="80" w:line="480" w:lineRule="auto"/>
       <w:contextualSpacing/>
       <w:jc w:val="center"/>
     </w:pPr>
     <w:rPr>
-      <w:rFonts w:asciiTheme="majorHAnsi" w:cstheme="majorBidi" w:eastAsiaTheme="majorEastAsia" w:hAnsiTheme="majorHAnsi"/>
-      <w:sz w:val="56"/>
-      <w:szCs w:val="56"/>
+      <w:rFonts w:ascii="Times New Roman" w:cs="Times New Roman" w:hAnsi="Times New Roman"/>
+      <w:b w:val="1"/>
+      <w:color w:val="000000"/>
+      <w:spacing w:val="0"/>
+      <w:sz w:val="24"/>
+      <w:szCs w:val="24"/>
     </w:rPr>
   </w:style>
   <w:style w:customStyle="1" w:styleId="TitleChar" w:type="character">
@@ -1942,9 +2602,12 @@
     <w:uiPriority w:val="10"/>
     <w:rsid w:val="00A10FD9"/>
     <w:rPr>
-      <w:rFonts w:asciiTheme="majorHAnsi" w:cstheme="majorBidi" w:eastAsiaTheme="majorEastAsia" w:hAnsiTheme="majorHAnsi"/>
-      <w:sz w:val="56"/>
-      <w:szCs w:val="56"/>
+      <w:rFonts w:ascii="Times New Roman" w:cs="Times New Roman" w:hAnsi="Times New Roman"/>
+      <w:b w:val="1"/>
+      <w:color w:val="000000"/>
+      <w:spacing w:val="0"/>
+      <w:sz w:val="24"/>
+      <w:szCs w:val="24"/>
     </w:rPr>
   </w:style>
   <w:style w:styleId="Subtitle" w:type="paragraph">
@@ -1959,12 +2622,14 @@
       <w:numPr>
         <w:ilvl w:val="1"/>
       </w:numPr>
+      <w:spacing w:line="480" w:lineRule="auto"/>
     </w:pPr>
     <w:rPr>
-      <w:rFonts w:cstheme="majorBidi" w:eastAsiaTheme="majorEastAsia"/>
-      <w:spacing w:val="15"/>
-      <w:sz w:val="28"/>
-      <w:szCs w:val="28"/>
+      <w:rFonts w:ascii="Times New Roman" w:cs="Times New Roman" w:hAnsi="Times New Roman"/>
+      <w:color w:val="000000"/>
+      <w:spacing w:val="0"/>
+      <w:sz w:val="24"/>
+      <w:szCs w:val="24"/>
     </w:rPr>
   </w:style>
   <w:style w:customStyle="1" w:styleId="SubtitleChar" w:type="character">
@@ -1974,11 +2639,11 @@
     <w:uiPriority w:val="11"/>
     <w:rsid w:val="00A10FD9"/>
     <w:rPr>
-      <w:rFonts w:cstheme="majorBidi" w:eastAsiaTheme="majorEastAsia"/>
-      <w:color w:themeColor="text1" w:themeTint="A6" w:val="595959"/>
-      <w:spacing w:val="15"/>
-      <w:sz w:val="28"/>
-      <w:szCs w:val="28"/>
+      <w:rFonts w:ascii="Times New Roman" w:cs="Times New Roman" w:hAnsi="Times New Roman"/>
+      <w:color w:val="000000"/>
+      <w:spacing w:val="0"/>
+      <w:sz w:val="24"/>
+      <w:szCs w:val="24"/>
     </w:rPr>
   </w:style>
   <w:style w:customStyle="1" w:styleId="Author" w:type="paragraph">
@@ -1989,8 +2654,10 @@
     <w:pPr>
       <w:keepNext/>
       <w:keepLines/>
+      <w:spacing w:line="480" w:lineRule="auto"/>
     </w:pPr>
     <w:rPr>
+      <w:rFonts w:ascii="Times New Roman" w:cs="Times New Roman" w:hAnsi="Times New Roman"/>
       <w:sz w:val="24"/>
       <w:szCs w:val="24"/>
     </w:rPr>
@@ -2003,8 +2670,10 @@
     <w:pPr>
       <w:keepNext/>
       <w:keepLines/>
+      <w:spacing w:line="480" w:lineRule="auto"/>
     </w:pPr>
     <w:rPr>
+      <w:rFonts w:ascii="Times New Roman" w:cs="Times New Roman" w:hAnsi="Times New Roman"/>
       <w:sz w:val="24"/>
       <w:szCs w:val="24"/>
     </w:rPr>
@@ -2017,13 +2686,14 @@
     <w:pPr>
       <w:keepNext/>
       <w:keepLines/>
-      <w:spacing w:after="0" w:before="300"/>
+      <w:spacing w:after="0" w:before="300" w:line="480" w:lineRule="auto"/>
       <w:jc w:val="center"/>
     </w:pPr>
     <w:rPr>
+      <w:rFonts w:ascii="Times New Roman" w:cs="Times New Roman" w:hAnsi="Times New Roman"/>
       <w:b/>
-      <w:sz w:val="20"/>
-      <w:szCs w:val="20"/>
+      <w:sz w:val="24"/>
+      <w:szCs w:val="24"/>
     </w:rPr>
   </w:style>
   <w:style w:customStyle="1" w:styleId="Abstract" w:type="paragraph">
@@ -2034,11 +2704,12 @@
     <w:pPr>
       <w:keepNext/>
       <w:keepLines/>
-      <w:spacing w:after="300" w:before="100"/>
+      <w:spacing w:after="300" w:before="100" w:line="480" w:lineRule="auto"/>
     </w:pPr>
     <w:rPr>
-      <w:sz w:val="20"/>
-      <w:szCs w:val="20"/>
+      <w:rFonts w:ascii="Times New Roman" w:cs="Times New Roman" w:hAnsi="Times New Roman"/>
+      <w:sz w:val="24"/>
+      <w:szCs w:val="24"/>
     </w:rPr>
   </w:style>
   <w:style w:styleId="Bibliography" w:type="paragraph">
@@ -2046,8 +2717,14 @@
     <w:basedOn w:val="Normal"/>
     <w:next w:val="Bibliography"/>
     <w:qFormat/>
-    <w:pPr/>
-    <w:rPr/>
+    <w:pPr>
+      <w:spacing w:line="480" w:lineRule="auto"/>
+    </w:pPr>
+    <w:rPr>
+      <w:rFonts w:ascii="Times New Roman" w:cs="Times New Roman" w:hAnsi="Times New Roman"/>
+      <w:sz w:val="24"/>
+      <w:szCs w:val="24"/>
+    </w:rPr>
   </w:style>
   <w:style w:styleId="Heading1" w:type="paragraph">
     <w:name w:val="heading 1"/>
@@ -2060,14 +2737,16 @@
     <w:pPr>
       <w:keepNext/>
       <w:keepLines/>
-      <w:spacing w:after="80" w:before="360"/>
+      <w:spacing w:after="80" w:before="360" w:line="480" w:lineRule="auto"/>
       <w:outlineLvl w:val="0"/>
     </w:pPr>
     <w:rPr>
-      <w:rFonts w:asciiTheme="majorHAnsi" w:cstheme="majorBidi" w:eastAsiaTheme="majorEastAsia" w:hAnsiTheme="majorHAnsi"/>
-      <w:color w:themeColor="accent1" w:themeShade="BF" w:val="0F4761"/>
-      <w:sz w:val="40"/>
-      <w:szCs w:val="40"/>
+      <w:rFonts w:ascii="Times New Roman" w:cs="Times New Roman" w:hAnsi="Times New Roman"/>
+      <w:b w:val="1"/>
+      <w:color w:val="000000"/>
+      <w:spacing w:val="0"/>
+      <w:sz w:val="24"/>
+      <w:szCs w:val="24"/>
     </w:rPr>
   </w:style>
   <w:style w:styleId="Heading2" w:type="paragraph">
@@ -2083,14 +2762,16 @@
     <w:pPr>
       <w:keepNext/>
       <w:keepLines/>
-      <w:spacing w:after="80" w:before="160"/>
+      <w:spacing w:after="80" w:before="160" w:line="480" w:lineRule="auto"/>
       <w:outlineLvl w:val="1"/>
     </w:pPr>
     <w:rPr>
-      <w:rFonts w:asciiTheme="majorHAnsi" w:cstheme="majorBidi" w:eastAsiaTheme="majorEastAsia" w:hAnsiTheme="majorHAnsi"/>
-      <w:color w:themeColor="accent1" w:themeShade="BF" w:val="0F4761"/>
-      <w:sz w:val="32"/>
-      <w:szCs w:val="32"/>
+      <w:rFonts w:ascii="Times New Roman" w:cs="Times New Roman" w:hAnsi="Times New Roman"/>
+      <w:b w:val="1"/>
+      <w:color w:val="000000"/>
+      <w:spacing w:val="0"/>
+      <w:sz w:val="24"/>
+      <w:szCs w:val="24"/>
     </w:rPr>
   </w:style>
   <w:style w:styleId="Heading3" w:type="paragraph">
@@ -2106,14 +2787,16 @@
     <w:pPr>
       <w:keepNext/>
       <w:keepLines/>
-      <w:spacing w:after="80" w:before="160"/>
+      <w:spacing w:after="80" w:before="160" w:line="480" w:lineRule="auto"/>
       <w:outlineLvl w:val="2"/>
     </w:pPr>
     <w:rPr>
-      <w:rFonts w:cstheme="majorBidi" w:eastAsiaTheme="majorEastAsia"/>
-      <w:color w:themeColor="accent1" w:themeShade="BF" w:val="0F4761"/>
-      <w:sz w:val="28"/>
-      <w:szCs w:val="28"/>
+      <w:rFonts w:ascii="Times New Roman" w:cs="Times New Roman" w:hAnsi="Times New Roman"/>
+      <w:b w:val="1"/>
+      <w:color w:val="000000"/>
+      <w:spacing w:val="0"/>
+      <w:sz w:val="24"/>
+      <w:szCs w:val="24"/>
     </w:rPr>
   </w:style>
   <w:style w:styleId="Heading4" w:type="paragraph">
@@ -2129,14 +2812,18 @@
     <w:pPr>
       <w:keepNext/>
       <w:keepLines/>
-      <w:spacing w:after="40" w:before="80"/>
+      <w:spacing w:after="40" w:before="80" w:line="480" w:lineRule="auto"/>
       <w:outlineLvl w:val="3"/>
     </w:pPr>
     <w:rPr>
-      <w:rFonts w:cstheme="majorBidi" w:eastAsiaTheme="majorEastAsia"/>
+      <w:rFonts w:ascii="Times New Roman" w:cs="Times New Roman" w:hAnsi="Times New Roman"/>
+      <w:b w:val="1"/>
       <w:i/>
       <w:iCs/>
-      <w:color w:themeColor="accent1" w:themeShade="BF" w:val="0F4761"/>
+      <w:color w:val="000000"/>
+      <w:spacing w:val="0"/>
+      <w:sz w:val="24"/>
+      <w:szCs w:val="24"/>
     </w:rPr>
   </w:style>
   <w:style w:styleId="Heading5" w:type="paragraph">
@@ -2152,12 +2839,16 @@
     <w:pPr>
       <w:keepNext/>
       <w:keepLines/>
-      <w:spacing w:after="40" w:before="80"/>
+      <w:spacing w:after="40" w:before="80" w:line="480" w:lineRule="auto"/>
       <w:outlineLvl w:val="4"/>
     </w:pPr>
     <w:rPr>
-      <w:rFonts w:cstheme="majorBidi" w:eastAsiaTheme="majorEastAsia"/>
-      <w:color w:themeColor="accent1" w:themeShade="BF" w:val="0F4761"/>
+      <w:rFonts w:ascii="Times New Roman" w:cs="Times New Roman" w:hAnsi="Times New Roman"/>
+      <w:b w:val="1"/>
+      <w:color w:val="000000"/>
+      <w:spacing w:val="0"/>
+      <w:sz w:val="24"/>
+      <w:szCs w:val="24"/>
     </w:rPr>
   </w:style>
   <w:style w:styleId="Heading6" w:type="paragraph">
@@ -2173,14 +2864,18 @@
     <w:pPr>
       <w:keepNext/>
       <w:keepLines/>
-      <w:spacing w:after="0" w:before="40"/>
+      <w:spacing w:after="0" w:before="40" w:line="480" w:lineRule="auto"/>
       <w:outlineLvl w:val="5"/>
     </w:pPr>
     <w:rPr>
-      <w:rFonts w:cstheme="majorBidi" w:eastAsiaTheme="majorEastAsia"/>
+      <w:rFonts w:ascii="Times New Roman" w:cs="Times New Roman" w:hAnsi="Times New Roman"/>
+      <w:b w:val="1"/>
       <w:i/>
       <w:iCs/>
-      <w:color w:themeColor="text1" w:themeTint="A6" w:val="595959"/>
+      <w:color w:val="000000"/>
+      <w:spacing w:val="0"/>
+      <w:sz w:val="24"/>
+      <w:szCs w:val="24"/>
     </w:rPr>
   </w:style>
   <w:style w:styleId="Heading7" w:type="paragraph">
@@ -2196,12 +2891,16 @@
     <w:pPr>
       <w:keepNext/>
       <w:keepLines/>
-      <w:spacing w:after="0" w:before="40"/>
+      <w:spacing w:after="0" w:before="40" w:line="480" w:lineRule="auto"/>
       <w:outlineLvl w:val="6"/>
     </w:pPr>
     <w:rPr>
-      <w:rFonts w:cstheme="majorBidi" w:eastAsiaTheme="majorEastAsia"/>
-      <w:color w:themeColor="text1" w:themeTint="A6" w:val="595959"/>
+      <w:rFonts w:ascii="Times New Roman" w:cs="Times New Roman" w:hAnsi="Times New Roman"/>
+      <w:b w:val="1"/>
+      <w:color w:val="000000"/>
+      <w:spacing w:val="0"/>
+      <w:sz w:val="24"/>
+      <w:szCs w:val="24"/>
     </w:rPr>
   </w:style>
   <w:style w:styleId="Heading8" w:type="paragraph">
@@ -2217,14 +2916,18 @@
     <w:pPr>
       <w:keepNext/>
       <w:keepLines/>
-      <w:spacing w:after="0"/>
+      <w:spacing w:after="0" w:line="480" w:lineRule="auto"/>
       <w:outlineLvl w:val="7"/>
     </w:pPr>
     <w:rPr>
-      <w:rFonts w:cstheme="majorBidi" w:eastAsiaTheme="majorEastAsia"/>
+      <w:rFonts w:ascii="Times New Roman" w:cs="Times New Roman" w:hAnsi="Times New Roman"/>
+      <w:b w:val="1"/>
       <w:i/>
       <w:iCs/>
-      <w:color w:themeColor="text1" w:themeTint="D8" w:val="272727"/>
+      <w:color w:val="000000"/>
+      <w:spacing w:val="0"/>
+      <w:sz w:val="24"/>
+      <w:szCs w:val="24"/>
     </w:rPr>
   </w:style>
   <w:style w:styleId="Heading9" w:type="paragraph">
@@ -2240,12 +2943,16 @@
     <w:pPr>
       <w:keepNext/>
       <w:keepLines/>
-      <w:spacing w:after="0"/>
+      <w:spacing w:after="0" w:line="480" w:lineRule="auto"/>
       <w:outlineLvl w:val="8"/>
     </w:pPr>
     <w:rPr>
-      <w:rFonts w:cstheme="majorBidi" w:eastAsiaTheme="majorEastAsia"/>
-      <w:color w:themeColor="text1" w:themeTint="D8" w:val="272727"/>
+      <w:rFonts w:ascii="Times New Roman" w:cs="Times New Roman" w:hAnsi="Times New Roman"/>
+      <w:b w:val="1"/>
+      <w:color w:val="000000"/>
+      <w:spacing w:val="0"/>
+      <w:sz w:val="24"/>
+      <w:szCs w:val="24"/>
     </w:rPr>
   </w:style>
   <w:style w:customStyle="1" w:styleId="Heading1Char" w:type="character">
@@ -2255,10 +2962,12 @@
     <w:uiPriority w:val="9"/>
     <w:rsid w:val="00A10FD9"/>
     <w:rPr>
-      <w:rFonts w:asciiTheme="majorHAnsi" w:cstheme="majorBidi" w:eastAsiaTheme="majorEastAsia" w:hAnsiTheme="majorHAnsi"/>
-      <w:color w:themeColor="accent1" w:themeShade="BF" w:val="0F4761"/>
-      <w:sz w:val="40"/>
-      <w:szCs w:val="40"/>
+      <w:rFonts w:ascii="Times New Roman" w:cs="Times New Roman" w:hAnsi="Times New Roman"/>
+      <w:b w:val="1"/>
+      <w:color w:val="000000"/>
+      <w:spacing w:val="0"/>
+      <w:sz w:val="24"/>
+      <w:szCs w:val="24"/>
     </w:rPr>
   </w:style>
   <w:style w:customStyle="1" w:styleId="Heading2Char" w:type="character">
@@ -2269,10 +2978,12 @@
     <w:semiHidden/>
     <w:rsid w:val="00A10FD9"/>
     <w:rPr>
-      <w:rFonts w:asciiTheme="majorHAnsi" w:cstheme="majorBidi" w:eastAsiaTheme="majorEastAsia" w:hAnsiTheme="majorHAnsi"/>
-      <w:color w:themeColor="accent1" w:themeShade="BF" w:val="0F4761"/>
-      <w:sz w:val="32"/>
-      <w:szCs w:val="32"/>
+      <w:rFonts w:ascii="Times New Roman" w:cs="Times New Roman" w:hAnsi="Times New Roman"/>
+      <w:b w:val="1"/>
+      <w:color w:val="000000"/>
+      <w:spacing w:val="0"/>
+      <w:sz w:val="24"/>
+      <w:szCs w:val="24"/>
     </w:rPr>
   </w:style>
   <w:style w:customStyle="1" w:styleId="Heading3Char" w:type="character">
@@ -2283,10 +2994,12 @@
     <w:semiHidden/>
     <w:rsid w:val="00A10FD9"/>
     <w:rPr>
-      <w:rFonts w:cstheme="majorBidi" w:eastAsiaTheme="majorEastAsia"/>
-      <w:color w:themeColor="accent1" w:themeShade="BF" w:val="0F4761"/>
-      <w:sz w:val="28"/>
-      <w:szCs w:val="28"/>
+      <w:rFonts w:ascii="Times New Roman" w:cs="Times New Roman" w:hAnsi="Times New Roman"/>
+      <w:b w:val="1"/>
+      <w:color w:val="000000"/>
+      <w:spacing w:val="0"/>
+      <w:sz w:val="24"/>
+      <w:szCs w:val="24"/>
     </w:rPr>
   </w:style>
   <w:style w:customStyle="1" w:styleId="Heading4Char" w:type="character">
@@ -2297,10 +3010,14 @@
     <w:semiHidden/>
     <w:rsid w:val="00A10FD9"/>
     <w:rPr>
-      <w:rFonts w:cstheme="majorBidi" w:eastAsiaTheme="majorEastAsia"/>
+      <w:rFonts w:ascii="Times New Roman" w:cs="Times New Roman" w:hAnsi="Times New Roman"/>
+      <w:b w:val="1"/>
       <w:i/>
       <w:iCs/>
-      <w:color w:themeColor="accent1" w:themeShade="BF" w:val="0F4761"/>
+      <w:color w:val="000000"/>
+      <w:spacing w:val="0"/>
+      <w:sz w:val="24"/>
+      <w:szCs w:val="24"/>
     </w:rPr>
   </w:style>
   <w:style w:customStyle="1" w:styleId="Heading5Char" w:type="character">
@@ -2311,8 +3028,12 @@
     <w:semiHidden/>
     <w:rsid w:val="00A10FD9"/>
     <w:rPr>
-      <w:rFonts w:cstheme="majorBidi" w:eastAsiaTheme="majorEastAsia"/>
-      <w:color w:themeColor="accent1" w:themeShade="BF" w:val="0F4761"/>
+      <w:rFonts w:ascii="Times New Roman" w:cs="Times New Roman" w:hAnsi="Times New Roman"/>
+      <w:b w:val="1"/>
+      <w:color w:val="000000"/>
+      <w:spacing w:val="0"/>
+      <w:sz w:val="24"/>
+      <w:szCs w:val="24"/>
     </w:rPr>
   </w:style>
   <w:style w:customStyle="1" w:styleId="Heading6Char" w:type="character">
@@ -2323,10 +3044,14 @@
     <w:semiHidden/>
     <w:rsid w:val="00A10FD9"/>
     <w:rPr>
-      <w:rFonts w:cstheme="majorBidi" w:eastAsiaTheme="majorEastAsia"/>
+      <w:rFonts w:ascii="Times New Roman" w:cs="Times New Roman" w:hAnsi="Times New Roman"/>
+      <w:b w:val="1"/>
       <w:i/>
       <w:iCs/>
-      <w:color w:themeColor="text1" w:themeTint="A6" w:val="595959"/>
+      <w:color w:val="000000"/>
+      <w:spacing w:val="0"/>
+      <w:sz w:val="24"/>
+      <w:szCs w:val="24"/>
     </w:rPr>
   </w:style>
   <w:style w:customStyle="1" w:styleId="Heading7Char" w:type="character">
@@ -2337,8 +3062,12 @@
     <w:semiHidden/>
     <w:rsid w:val="00A10FD9"/>
     <w:rPr>
-      <w:rFonts w:cstheme="majorBidi" w:eastAsiaTheme="majorEastAsia"/>
-      <w:color w:themeColor="text1" w:themeTint="A6" w:val="595959"/>
+      <w:rFonts w:ascii="Times New Roman" w:cs="Times New Roman" w:hAnsi="Times New Roman"/>
+      <w:b w:val="1"/>
+      <w:color w:val="000000"/>
+      <w:spacing w:val="0"/>
+      <w:sz w:val="24"/>
+      <w:szCs w:val="24"/>
     </w:rPr>
   </w:style>
   <w:style w:customStyle="1" w:styleId="Heading8Char" w:type="character">
@@ -2349,10 +3078,14 @@
     <w:semiHidden/>
     <w:rsid w:val="00A10FD9"/>
     <w:rPr>
-      <w:rFonts w:cstheme="majorBidi" w:eastAsiaTheme="majorEastAsia"/>
+      <w:rFonts w:ascii="Times New Roman" w:cs="Times New Roman" w:hAnsi="Times New Roman"/>
+      <w:b w:val="1"/>
       <w:i/>
       <w:iCs/>
-      <w:color w:themeColor="text1" w:themeTint="D8" w:val="272727"/>
+      <w:color w:val="000000"/>
+      <w:spacing w:val="0"/>
+      <w:sz w:val="24"/>
+      <w:szCs w:val="24"/>
     </w:rPr>
   </w:style>
   <w:style w:customStyle="1" w:styleId="Heading9Char" w:type="character">
@@ -2363,8 +3096,12 @@
     <w:semiHidden/>
     <w:rsid w:val="00A10FD9"/>
     <w:rPr>
-      <w:rFonts w:cstheme="majorBidi" w:eastAsiaTheme="majorEastAsia"/>
-      <w:color w:themeColor="text1" w:themeTint="D8" w:val="272727"/>
+      <w:rFonts w:ascii="Times New Roman" w:cs="Times New Roman" w:hAnsi="Times New Roman"/>
+      <w:b w:val="1"/>
+      <w:color w:val="000000"/>
+      <w:spacing w:val="0"/>
+      <w:sz w:val="24"/>
+      <w:szCs w:val="24"/>
     </w:rPr>
   </w:style>
   <w:style w:styleId="BlockText" w:type="paragraph">
@@ -2375,7 +3112,7 @@
     <w:unhideWhenUsed/>
     <w:qFormat/>
     <w:pPr>
-      <w:spacing w:after="100" w:before="100"/>
+      <w:spacing w:after="100" w:before="100" w:line="480" w:lineRule="auto"/>
       <w:ind w:firstLine="0" w:left="480" w:right="480"/>
     </w:pPr>
   </w:style>
@@ -2386,6 +3123,9 @@
     <w:uiPriority w:val="9"/>
     <w:unhideWhenUsed/>
     <w:qFormat/>
+    <w:pPr>
+      <w:spacing w:line="480" w:lineRule="auto"/>
+    </w:pPr>
   </w:style>
   <w:style w:styleId="FootnoteBlockText" w:type="paragraph">
     <w:name w:val="Footnote Block Text"/>
@@ -2395,7 +3135,7 @@
     <w:unhideWhenUsed/>
     <w:qFormat/>
     <w:pPr>
-      <w:spacing w:after="100" w:before="100"/>
+      <w:spacing w:after="100" w:before="100" w:line="480" w:lineRule="auto"/>
       <w:ind w:firstLine="0" w:left="480" w:right="480"/>
     </w:pPr>
   </w:style>
@@ -2435,25 +3175,35 @@
     <w:pPr>
       <w:keepNext/>
       <w:keepLines/>
-      <w:spacing w:after="0"/>
+      <w:spacing w:after="0" w:line="480" w:lineRule="auto"/>
     </w:pPr>
     <w:rPr>
+      <w:rFonts w:ascii="Times New Roman" w:cs="Times New Roman" w:hAnsi="Times New Roman"/>
       <w:b/>
+      <w:sz w:val="24"/>
+      <w:szCs w:val="24"/>
     </w:rPr>
   </w:style>
   <w:style w:customStyle="1" w:styleId="Definition" w:type="paragraph">
     <w:name w:val="Definition"/>
     <w:basedOn w:val="Normal"/>
+    <w:pPr>
+      <w:spacing w:line="480" w:lineRule="auto"/>
+    </w:pPr>
   </w:style>
   <w:style w:styleId="Caption" w:type="paragraph">
     <w:name w:val="Caption"/>
     <w:basedOn w:val="Normal"/>
     <w:link w:val="BodyTextChar"/>
     <w:pPr>
-      <w:spacing w:after="120" w:before="0"/>
+      <w:keepLines w:val="1"/>
+      <w:spacing w:after="120" w:before="0" w:line="480" w:lineRule="auto"/>
     </w:pPr>
     <w:rPr>
-      <w:i/>
+      <w:rFonts w:ascii="Times New Roman" w:cs="Times New Roman" w:hAnsi="Times New Roman"/>
+      <w:i w:val="0"/>
+      <w:sz w:val="24"/>
+      <w:szCs w:val="24"/>
     </w:rPr>
   </w:style>
   <w:style w:customStyle="1" w:styleId="TableCaption" w:type="paragraph">
@@ -2461,22 +3211,51 @@
     <w:basedOn w:val="Caption"/>
     <w:pPr>
       <w:keepNext/>
+      <w:keepLines w:val="1"/>
+      <w:spacing w:line="480" w:lineRule="auto"/>
     </w:pPr>
+    <w:rPr>
+      <w:rFonts w:ascii="Times New Roman" w:hAnsi="Times New Roman" w:cs="Times New Roman"/>
+      <w:i w:val="0"/>
+      <w:sz w:val="24"/>
+      <w:szCs w:val="24"/>
+    </w:rPr>
   </w:style>
   <w:style w:customStyle="1" w:styleId="ImageCaption" w:type="paragraph">
     <w:name w:val="Image Caption"/>
     <w:basedOn w:val="Caption"/>
+    <w:pPr>
+      <w:keepLines w:val="1"/>
+      <w:spacing w:line="480" w:lineRule="auto"/>
+    </w:pPr>
+    <w:rPr>
+      <w:rFonts w:ascii="Times New Roman" w:hAnsi="Times New Roman" w:cs="Times New Roman"/>
+      <w:i w:val="0"/>
+      <w:sz w:val="24"/>
+      <w:szCs w:val="24"/>
+    </w:rPr>
   </w:style>
   <w:style w:customStyle="1" w:styleId="Figure" w:type="paragraph">
     <w:name w:val="Figure"/>
     <w:basedOn w:val="Normal"/>
+    <w:pPr>
+      <w:spacing w:line="480" w:lineRule="auto"/>
+    </w:pPr>
   </w:style>
   <w:style w:customStyle="1" w:styleId="CaptionedFigure" w:type="paragraph">
     <w:name w:val="Captioned Figure"/>
     <w:basedOn w:val="Figure"/>
     <w:pPr>
       <w:keepNext/>
+      <w:keepLines w:val="1"/>
+      <w:spacing w:line="480" w:lineRule="auto"/>
     </w:pPr>
+    <w:rPr>
+      <w:rFonts w:ascii="Times New Roman" w:hAnsi="Times New Roman" w:cs="Times New Roman"/>
+      <w:i w:val="0"/>
+      <w:sz w:val="24"/>
+      <w:szCs w:val="24"/>
+    </w:rPr>
   </w:style>
   <w:style w:customStyle="1" w:styleId="BodyTextChar" w:type="character">
     <w:name w:val="Body Text Char"/>
@@ -2487,8 +3266,9 @@
     <w:name w:val="Verbatim Char"/>
     <w:basedOn w:val="BodyTextChar"/>
     <w:rPr>
-      <w:rFonts w:ascii="Consolas" w:hAnsi="Consolas"/>
-      <w:sz w:val="22"/>
+      <w:rFonts w:ascii="Times New Roman" w:cs="Times New Roman" w:hAnsi="Times New Roman"/>
+      <w:sz w:val="24"/>
+      <w:szCs w:val="24"/>
     </w:rPr>
   </w:style>
   <w:style w:customStyle="1" w:styleId="SectionNumber" w:type="character">
@@ -2499,6 +3279,9 @@
     <w:name w:val="Footnote Reference"/>
     <w:basedOn w:val="BodyTextChar"/>
     <w:rPr>
+      <w:rFonts w:ascii="Times New Roman" w:cs="Times New Roman" w:hAnsi="Times New Roman"/>
+      <w:sz w:val="24"/>
+      <w:szCs w:val="24"/>
       <w:vertAlign w:val="superscript"/>
     </w:rPr>
   </w:style>
@@ -2506,7 +3289,10 @@
     <w:name w:val="Hyperlink"/>
     <w:basedOn w:val="BodyTextChar"/>
     <w:rPr>
+      <w:rFonts w:ascii="Times New Roman" w:cs="Times New Roman" w:hAnsi="Times New Roman"/>
       <w:color w:themeColor="accent1" w:val="4F81BD"/>
+      <w:sz w:val="24"/>
+      <w:szCs w:val="24"/>
     </w:rPr>
   </w:style>
   <w:style w:styleId="TOCHeading" w:type="paragraph">
@@ -2517,14 +3303,16 @@
     <w:unhideWhenUsed/>
     <w:qFormat/>
     <w:pPr>
-      <w:spacing w:before="240" w:line="259" w:lineRule="auto"/>
+      <w:spacing w:before="240" w:line="480" w:lineRule="auto"/>
       <w:outlineLvl w:val="9"/>
     </w:pPr>
     <w:rPr>
-      <w:rFonts w:asciiTheme="majorHAnsi" w:cstheme="majorBidi" w:eastAsiaTheme="majorEastAsia" w:hAnsiTheme="majorHAnsi"/>
+      <w:rFonts w:ascii="Times New Roman" w:cs="Times New Roman" w:hAnsi="Times New Roman"/>
       <w:b w:val="0"/>
       <w:bCs w:val="0"/>
       <w:color w:themeColor="accent1" w:themeShade="BF" w:val="365F91"/>
+      <w:sz w:val="24"/>
+      <w:szCs w:val="24"/>
     </w:rPr>
   </w:style>
   <w:style w:type="paragraph" w:customStyle="1" w:styleId="SourceCode">
@@ -2532,16 +3320,20 @@
     <w:basedOn w:val="Normal"/>
     <w:link w:val="VerbatimChar"/>
     <w:pPr>
+      <w:shd w:val="clear" w:fill="f1f3f5"/>
       <w:wordWrap w:val="off"/>
-      <w:shd w:val="clear" w:fill="f1f3f5"/>
+      <w:spacing w:line="480" w:lineRule="auto"/>
     </w:pPr>
   </w:style>
   <w:style w:type="character" w:customStyle="1" w:styleId="KeywordTok">
     <w:name w:val="KeywordTok"/>
     <w:basedOn w:val="VerbatimChar"/>
     <w:rPr>
+      <w:rFonts w:ascii="Times New Roman" w:hAnsi="Times New Roman" w:cs="Times New Roman"/>
       <w:b/>
       <w:color w:val="003b4f"/>
+      <w:sz w:val="24"/>
+      <w:szCs w:val="24"/>
       <w:shd w:val="clear" w:fill="f1f3f5"/>
     </w:rPr>
   </w:style>
@@ -2549,7 +3341,10 @@
     <w:name w:val="DataTypeTok"/>
     <w:basedOn w:val="VerbatimChar"/>
     <w:rPr>
+      <w:rFonts w:ascii="Times New Roman" w:hAnsi="Times New Roman" w:cs="Times New Roman"/>
       <w:color w:val="ad0000"/>
+      <w:sz w:val="24"/>
+      <w:szCs w:val="24"/>
       <w:shd w:val="clear" w:fill="f1f3f5"/>
     </w:rPr>
   </w:style>
@@ -2557,7 +3352,10 @@
     <w:name w:val="DecValTok"/>
     <w:basedOn w:val="VerbatimChar"/>
     <w:rPr>
+      <w:rFonts w:ascii="Times New Roman" w:hAnsi="Times New Roman" w:cs="Times New Roman"/>
       <w:color w:val="ad0000"/>
+      <w:sz w:val="24"/>
+      <w:szCs w:val="24"/>
       <w:shd w:val="clear" w:fill="f1f3f5"/>
     </w:rPr>
   </w:style>
@@ -2565,7 +3363,10 @@
     <w:name w:val="BaseNTok"/>
     <w:basedOn w:val="VerbatimChar"/>
     <w:rPr>
+      <w:rFonts w:ascii="Times New Roman" w:hAnsi="Times New Roman" w:cs="Times New Roman"/>
       <w:color w:val="ad0000"/>
+      <w:sz w:val="24"/>
+      <w:szCs w:val="24"/>
       <w:shd w:val="clear" w:fill="f1f3f5"/>
     </w:rPr>
   </w:style>
@@ -2573,7 +3374,10 @@
     <w:name w:val="FloatTok"/>
     <w:basedOn w:val="VerbatimChar"/>
     <w:rPr>
+      <w:rFonts w:ascii="Times New Roman" w:hAnsi="Times New Roman" w:cs="Times New Roman"/>
       <w:color w:val="ad0000"/>
+      <w:sz w:val="24"/>
+      <w:szCs w:val="24"/>
       <w:shd w:val="clear" w:fill="f1f3f5"/>
     </w:rPr>
   </w:style>
@@ -2581,7 +3385,10 @@
     <w:name w:val="ConstantTok"/>
     <w:basedOn w:val="VerbatimChar"/>
     <w:rPr>
+      <w:rFonts w:ascii="Times New Roman" w:hAnsi="Times New Roman" w:cs="Times New Roman"/>
       <w:color w:val="8f5902"/>
+      <w:sz w:val="24"/>
+      <w:szCs w:val="24"/>
       <w:shd w:val="clear" w:fill="f1f3f5"/>
     </w:rPr>
   </w:style>
@@ -2589,7 +3396,10 @@
     <w:name w:val="CharTok"/>
     <w:basedOn w:val="VerbatimChar"/>
     <w:rPr>
+      <w:rFonts w:ascii="Times New Roman" w:hAnsi="Times New Roman" w:cs="Times New Roman"/>
       <w:color w:val="20794d"/>
+      <w:sz w:val="24"/>
+      <w:szCs w:val="24"/>
       <w:shd w:val="clear" w:fill="f1f3f5"/>
     </w:rPr>
   </w:style>
@@ -2597,7 +3407,10 @@
     <w:name w:val="SpecialCharTok"/>
     <w:basedOn w:val="VerbatimChar"/>
     <w:rPr>
+      <w:rFonts w:ascii="Times New Roman" w:hAnsi="Times New Roman" w:cs="Times New Roman"/>
       <w:color w:val="5e5e5e"/>
+      <w:sz w:val="24"/>
+      <w:szCs w:val="24"/>
       <w:shd w:val="clear" w:fill="f1f3f5"/>
     </w:rPr>
   </w:style>
@@ -2605,7 +3418,10 @@
     <w:name w:val="StringTok"/>
     <w:basedOn w:val="VerbatimChar"/>
     <w:rPr>
+      <w:rFonts w:ascii="Times New Roman" w:hAnsi="Times New Roman" w:cs="Times New Roman"/>
       <w:color w:val="20794d"/>
+      <w:sz w:val="24"/>
+      <w:szCs w:val="24"/>
       <w:shd w:val="clear" w:fill="f1f3f5"/>
     </w:rPr>
   </w:style>
@@ -2613,7 +3429,10 @@
     <w:name w:val="VerbatimStringTok"/>
     <w:basedOn w:val="VerbatimChar"/>
     <w:rPr>
+      <w:rFonts w:ascii="Times New Roman" w:hAnsi="Times New Roman" w:cs="Times New Roman"/>
       <w:color w:val="20794d"/>
+      <w:sz w:val="24"/>
+      <w:szCs w:val="24"/>
       <w:shd w:val="clear" w:fill="f1f3f5"/>
     </w:rPr>
   </w:style>
@@ -2621,7 +3440,10 @@
     <w:name w:val="SpecialStringTok"/>
     <w:basedOn w:val="VerbatimChar"/>
     <w:rPr>
+      <w:rFonts w:ascii="Times New Roman" w:hAnsi="Times New Roman" w:cs="Times New Roman"/>
       <w:color w:val="20794d"/>
+      <w:sz w:val="24"/>
+      <w:szCs w:val="24"/>
       <w:shd w:val="clear" w:fill="f1f3f5"/>
     </w:rPr>
   </w:style>
@@ -2629,7 +3451,10 @@
     <w:name w:val="ImportTok"/>
     <w:basedOn w:val="VerbatimChar"/>
     <w:rPr>
+      <w:rFonts w:ascii="Times New Roman" w:hAnsi="Times New Roman" w:cs="Times New Roman"/>
       <w:color w:val="00769e"/>
+      <w:sz w:val="24"/>
+      <w:szCs w:val="24"/>
       <w:shd w:val="clear" w:fill="f1f3f5"/>
     </w:rPr>
   </w:style>
@@ -2637,7 +3462,10 @@
     <w:name w:val="CommentTok"/>
     <w:basedOn w:val="VerbatimChar"/>
     <w:rPr>
+      <w:rFonts w:ascii="Times New Roman" w:hAnsi="Times New Roman" w:cs="Times New Roman"/>
       <w:color w:val="5e5e5e"/>
+      <w:sz w:val="24"/>
+      <w:szCs w:val="24"/>
       <w:shd w:val="clear" w:fill="f1f3f5"/>
     </w:rPr>
   </w:style>
@@ -2645,8 +3473,11 @@
     <w:name w:val="DocumentationTok"/>
     <w:basedOn w:val="VerbatimChar"/>
     <w:rPr>
+      <w:rFonts w:ascii="Times New Roman" w:hAnsi="Times New Roman" w:cs="Times New Roman"/>
       <w:i/>
       <w:color w:val="5e5e5e"/>
+      <w:sz w:val="24"/>
+      <w:szCs w:val="24"/>
       <w:shd w:val="clear" w:fill="f1f3f5"/>
     </w:rPr>
   </w:style>
@@ -2654,7 +3485,10 @@
     <w:name w:val="AnnotationTok"/>
     <w:basedOn w:val="VerbatimChar"/>
     <w:rPr>
+      <w:rFonts w:ascii="Times New Roman" w:hAnsi="Times New Roman" w:cs="Times New Roman"/>
       <w:color w:val="5e5e5e"/>
+      <w:sz w:val="24"/>
+      <w:szCs w:val="24"/>
       <w:shd w:val="clear" w:fill="f1f3f5"/>
     </w:rPr>
   </w:style>
@@ -2662,8 +3496,11 @@
     <w:name w:val="CommentVarTok"/>
     <w:basedOn w:val="VerbatimChar"/>
     <w:rPr>
+      <w:rFonts w:ascii="Times New Roman" w:hAnsi="Times New Roman" w:cs="Times New Roman"/>
       <w:i/>
       <w:color w:val="5e5e5e"/>
+      <w:sz w:val="24"/>
+      <w:szCs w:val="24"/>
       <w:shd w:val="clear" w:fill="f1f3f5"/>
     </w:rPr>
   </w:style>
@@ -2671,7 +3508,10 @@
     <w:name w:val="OtherTok"/>
     <w:basedOn w:val="VerbatimChar"/>
     <w:rPr>
+      <w:rFonts w:ascii="Times New Roman" w:hAnsi="Times New Roman" w:cs="Times New Roman"/>
       <w:color w:val="003b4f"/>
+      <w:sz w:val="24"/>
+      <w:szCs w:val="24"/>
       <w:shd w:val="clear" w:fill="f1f3f5"/>
     </w:rPr>
   </w:style>
@@ -2679,7 +3519,10 @@
     <w:name w:val="FunctionTok"/>
     <w:basedOn w:val="VerbatimChar"/>
     <w:rPr>
+      <w:rFonts w:ascii="Times New Roman" w:hAnsi="Times New Roman" w:cs="Times New Roman"/>
       <w:color w:val="4758ab"/>
+      <w:sz w:val="24"/>
+      <w:szCs w:val="24"/>
       <w:shd w:val="clear" w:fill="f1f3f5"/>
     </w:rPr>
   </w:style>
@@ -2687,7 +3530,10 @@
     <w:name w:val="VariableTok"/>
     <w:basedOn w:val="VerbatimChar"/>
     <w:rPr>
+      <w:rFonts w:ascii="Times New Roman" w:hAnsi="Times New Roman" w:cs="Times New Roman"/>
       <w:color w:val="111111"/>
+      <w:sz w:val="24"/>
+      <w:szCs w:val="24"/>
       <w:shd w:val="clear" w:fill="f1f3f5"/>
     </w:rPr>
   </w:style>
@@ -2695,8 +3541,11 @@
     <w:name w:val="ControlFlowTok"/>
     <w:basedOn w:val="VerbatimChar"/>
     <w:rPr>
+      <w:rFonts w:ascii="Times New Roman" w:hAnsi="Times New Roman" w:cs="Times New Roman"/>
       <w:b/>
       <w:color w:val="003b4f"/>
+      <w:sz w:val="24"/>
+      <w:szCs w:val="24"/>
       <w:shd w:val="clear" w:fill="f1f3f5"/>
     </w:rPr>
   </w:style>
@@ -2704,7 +3553,10 @@
     <w:name w:val="OperatorTok"/>
     <w:basedOn w:val="VerbatimChar"/>
     <w:rPr>
+      <w:rFonts w:ascii="Times New Roman" w:hAnsi="Times New Roman" w:cs="Times New Roman"/>
       <w:color w:val="5e5e5e"/>
+      <w:sz w:val="24"/>
+      <w:szCs w:val="24"/>
       <w:shd w:val="clear" w:fill="f1f3f5"/>
     </w:rPr>
   </w:style>
@@ -2712,7 +3564,10 @@
     <w:name w:val="BuiltInTok"/>
     <w:basedOn w:val="VerbatimChar"/>
     <w:rPr>
+      <w:rFonts w:ascii="Times New Roman" w:hAnsi="Times New Roman" w:cs="Times New Roman"/>
       <w:color w:val="003b4f"/>
+      <w:sz w:val="24"/>
+      <w:szCs w:val="24"/>
       <w:shd w:val="clear" w:fill="f1f3f5"/>
     </w:rPr>
   </w:style>
@@ -2720,7 +3575,10 @@
     <w:name w:val="ExtensionTok"/>
     <w:basedOn w:val="VerbatimChar"/>
     <w:rPr>
+      <w:rFonts w:ascii="Times New Roman" w:hAnsi="Times New Roman" w:cs="Times New Roman"/>
       <w:color w:val="003b4f"/>
+      <w:sz w:val="24"/>
+      <w:szCs w:val="24"/>
       <w:shd w:val="clear" w:fill="f1f3f5"/>
     </w:rPr>
   </w:style>
@@ -2728,7 +3586,10 @@
     <w:name w:val="PreprocessorTok"/>
     <w:basedOn w:val="VerbatimChar"/>
     <w:rPr>
+      <w:rFonts w:ascii="Times New Roman" w:hAnsi="Times New Roman" w:cs="Times New Roman"/>
       <w:color w:val="ad0000"/>
+      <w:sz w:val="24"/>
+      <w:szCs w:val="24"/>
       <w:shd w:val="clear" w:fill="f1f3f5"/>
     </w:rPr>
   </w:style>
@@ -2736,7 +3597,10 @@
     <w:name w:val="AttributeTok"/>
     <w:basedOn w:val="VerbatimChar"/>
     <w:rPr>
+      <w:rFonts w:ascii="Times New Roman" w:hAnsi="Times New Roman" w:cs="Times New Roman"/>
       <w:color w:val="657422"/>
+      <w:sz w:val="24"/>
+      <w:szCs w:val="24"/>
       <w:shd w:val="clear" w:fill="f1f3f5"/>
     </w:rPr>
   </w:style>
@@ -2744,7 +3608,10 @@
     <w:name w:val="RegionMarkerTok"/>
     <w:basedOn w:val="VerbatimChar"/>
     <w:rPr>
+      <w:rFonts w:ascii="Times New Roman" w:hAnsi="Times New Roman" w:cs="Times New Roman"/>
       <w:color w:val="003b4f"/>
+      <w:sz w:val="24"/>
+      <w:szCs w:val="24"/>
       <w:shd w:val="clear" w:fill="f1f3f5"/>
     </w:rPr>
   </w:style>
@@ -2752,7 +3619,10 @@
     <w:name w:val="InformationTok"/>
     <w:basedOn w:val="VerbatimChar"/>
     <w:rPr>
+      <w:rFonts w:ascii="Times New Roman" w:hAnsi="Times New Roman" w:cs="Times New Roman"/>
       <w:color w:val="5e5e5e"/>
+      <w:sz w:val="24"/>
+      <w:szCs w:val="24"/>
       <w:shd w:val="clear" w:fill="f1f3f5"/>
     </w:rPr>
   </w:style>
@@ -2760,8 +3630,11 @@
     <w:name w:val="WarningTok"/>
     <w:basedOn w:val="VerbatimChar"/>
     <w:rPr>
+      <w:rFonts w:ascii="Times New Roman" w:hAnsi="Times New Roman" w:cs="Times New Roman"/>
       <w:i/>
       <w:color w:val="5e5e5e"/>
+      <w:sz w:val="24"/>
+      <w:szCs w:val="24"/>
       <w:shd w:val="clear" w:fill="f1f3f5"/>
     </w:rPr>
   </w:style>
@@ -2769,7 +3642,10 @@
     <w:name w:val="AlertTok"/>
     <w:basedOn w:val="VerbatimChar"/>
     <w:rPr>
+      <w:rFonts w:ascii="Times New Roman" w:hAnsi="Times New Roman" w:cs="Times New Roman"/>
       <w:color w:val="ad0000"/>
+      <w:sz w:val="24"/>
+      <w:szCs w:val="24"/>
       <w:shd w:val="clear" w:fill="f1f3f5"/>
     </w:rPr>
   </w:style>
@@ -2777,7 +3653,10 @@
     <w:name w:val="ErrorTok"/>
     <w:basedOn w:val="VerbatimChar"/>
     <w:rPr>
+      <w:rFonts w:ascii="Times New Roman" w:hAnsi="Times New Roman" w:cs="Times New Roman"/>
       <w:color w:val="ad0000"/>
+      <w:sz w:val="24"/>
+      <w:szCs w:val="24"/>
       <w:shd w:val="clear" w:fill="f1f3f5"/>
     </w:rPr>
   </w:style>
@@ -2785,7 +3664,10 @@
     <w:name w:val="NormalTok"/>
     <w:basedOn w:val="VerbatimChar"/>
     <w:rPr>
+      <w:rFonts w:ascii="Times New Roman" w:hAnsi="Times New Roman" w:cs="Times New Roman"/>
       <w:color w:val="003b4f"/>
+      <w:sz w:val="24"/>
+      <w:szCs w:val="24"/>
       <w:shd w:val="clear" w:fill="f1f3f5"/>
     </w:rPr>
   </w:style>

</xml_diff>